<commit_message>
Per visite gesynchroniseerd met de handmatige aanpassingen in Per nummer
Per nummer is de leidende map (alle inhoudelijke correcties zijn daar
doorgevoerd); alle 102 betrokken bestanden in Per visite bijgewerkt naar
diezelfde inhoud. 145 documenten geverifieerd, geen fouten.
</commit_message>
<xml_diff>
--- a/(e)CRF/Per nummer/02_Toestemmingsformulier en kostenformulier (patient).docx
+++ b/(e)CRF/Per nummer/02_Toestemmingsformulier en kostenformulier (patient).docx
@@ -90,7 +90,6 @@
         </w:rPr>
         <w:t xml:space="preserve">Naar een druk-, therapietrouw- en </w:t>
       </w:r>
-      <w:proofErr w:type="spellStart"/>
       <w:r>
         <w:rPr>
           <w:color w:val="24303B"/>
@@ -98,9 +97,8 @@
           <w:szCs w:val="20"/>
           <w:lang w:val="nl-NL"/>
         </w:rPr>
-        <w:t>educatiegestuurde</w:t>
-      </w:r>
-      <w:proofErr w:type="spellEnd"/>
+        <w:t>educatie gestuurde</w:t>
+      </w:r>
       <w:r>
         <w:rPr>
           <w:color w:val="24303B"/>
@@ -854,7 +852,7 @@
         </w:rPr>
         <w:t xml:space="preserve">Prof. Kevin Deschamps, KU Leuven, </w:t>
       </w:r>
-      <w:hyperlink r:id="rId10" w:history="1">
+      <w:hyperlink r:id="rId11" w:history="1">
         <w:r>
           <w:rPr>
             <w:rStyle w:val="Hyperlink"/>
@@ -946,7 +944,7 @@
         </w:rPr>
         <w:t xml:space="preserve">Prof. Fabienne Dobbels, KU Leuven, </w:t>
       </w:r>
-      <w:hyperlink r:id="rId11" w:history="1">
+      <w:hyperlink r:id="rId12" w:history="1">
         <w:r>
           <w:rPr>
             <w:rStyle w:val="Hyperlink"/>
@@ -1041,7 +1039,7 @@
         </w:rPr>
         <w:t xml:space="preserve">, </w:t>
       </w:r>
-      <w:hyperlink r:id="rId12" w:history="1">
+      <w:hyperlink r:id="rId13" w:history="1">
         <w:r>
           <w:rPr>
             <w:rStyle w:val="Hyperlink"/>
@@ -1104,7 +1102,7 @@
         </w:rPr>
         <w:t xml:space="preserve">, </w:t>
       </w:r>
-      <w:hyperlink r:id="rId13" w:history="1">
+      <w:hyperlink r:id="rId14" w:history="1">
         <w:r>
           <w:rPr>
             <w:rStyle w:val="Hyperlink"/>
@@ -1180,9 +1178,31 @@
           <w:szCs w:val="20"/>
           <w:lang w:val="nl-BE"/>
         </w:rPr>
-        <w:t xml:space="preserve">Prof. Giovanni Matricali, UZ Leuven, </w:t>
-      </w:r>
-      <w:hyperlink r:id="rId14" w:history="1">
+        <w:t xml:space="preserve">Prof. Giovanni </w:t>
+      </w:r>
+      <w:proofErr w:type="spellStart"/>
+      <w:r>
+        <w:rPr>
+          <w:iCs/>
+          <w:color w:val="24303B"/>
+          <w:sz w:val="20"/>
+          <w:szCs w:val="20"/>
+          <w:lang w:val="nl-BE"/>
+        </w:rPr>
+        <w:t>Matricali</w:t>
+      </w:r>
+      <w:proofErr w:type="spellEnd"/>
+      <w:r>
+        <w:rPr>
+          <w:iCs/>
+          <w:color w:val="24303B"/>
+          <w:sz w:val="20"/>
+          <w:szCs w:val="20"/>
+          <w:lang w:val="nl-BE"/>
+        </w:rPr>
+        <w:t xml:space="preserve">, UZ Leuven, </w:t>
+      </w:r>
+      <w:hyperlink r:id="rId15" w:history="1">
         <w:r>
           <w:rPr>
             <w:rStyle w:val="Hyperlink"/>
@@ -1247,31 +1267,18 @@
         </w:rPr>
         <w:t xml:space="preserve">, </w:t>
       </w:r>
-      <w:r>
-        <w:fldChar w:fldCharType="begin"/>
-      </w:r>
-      <w:r>
-        <w:rPr>
-          <w:lang w:val="en-GB"/>
-        </w:rPr>
-        <w:instrText>HYPERLINK "mailto:caren.randon@uzgent.be"</w:instrText>
-      </w:r>
-      <w:r>
-        <w:fldChar w:fldCharType="separate"/>
-      </w:r>
-      <w:r>
-        <w:rPr>
-          <w:rStyle w:val="Hyperlink"/>
-          <w:iCs/>
-          <w:sz w:val="20"/>
-          <w:szCs w:val="20"/>
-          <w:lang w:val="en-US"/>
-        </w:rPr>
-        <w:t>caren.randon@uzgent.be</w:t>
-      </w:r>
-      <w:r>
-        <w:fldChar w:fldCharType="end"/>
-      </w:r>
+      <w:hyperlink r:id="rId16" w:history="1">
+        <w:r>
+          <w:rPr>
+            <w:rStyle w:val="Hyperlink"/>
+            <w:iCs/>
+            <w:sz w:val="20"/>
+            <w:szCs w:val="20"/>
+            <w:lang w:val="en-US"/>
+          </w:rPr>
+          <w:t>caren.randon@uzgent.be</w:t>
+        </w:r>
+      </w:hyperlink>
     </w:p>
     <w:p>
       <w:pPr>
@@ -1303,7 +1310,7 @@
         </w:rPr>
         <w:t xml:space="preserve">Prof. Eveline Dirinck, UZA, </w:t>
       </w:r>
-      <w:hyperlink r:id="rId15" w:history="1">
+      <w:hyperlink r:id="rId17" w:history="1">
         <w:r>
           <w:rPr>
             <w:rStyle w:val="Hyperlink"/>
@@ -1368,7 +1375,7 @@
         </w:rPr>
         <w:t xml:space="preserve">, </w:t>
       </w:r>
-      <w:hyperlink r:id="rId16" w:history="1">
+      <w:hyperlink r:id="rId18" w:history="1">
         <w:r>
           <w:rPr>
             <w:rStyle w:val="Hyperlink"/>
@@ -1421,7 +1428,7 @@
         </w:rPr>
         <w:t xml:space="preserve">int-Jan Brugge, </w:t>
       </w:r>
-      <w:hyperlink r:id="rId17" w:history="1">
+      <w:hyperlink r:id="rId19" w:history="1">
         <w:r>
           <w:rPr>
             <w:rStyle w:val="Hyperlink"/>
@@ -1474,7 +1481,7 @@
         </w:rPr>
         <w:t xml:space="preserve">roeninge, </w:t>
       </w:r>
-      <w:hyperlink r:id="rId18" w:history="1">
+      <w:hyperlink r:id="rId20" w:history="1">
         <w:r>
           <w:rPr>
             <w:rStyle w:val="Hyperlink"/>
@@ -1569,16 +1576,14 @@
         </w:rPr>
         <w:t xml:space="preserve">U wordt uitgenodigd om deel te nemen aan een wetenschappelijk onderzoek bij mensen met diabetes die een verhoogd risico hebben op voetproblemen. Voordat u beslist om al dan niet deel te nemen, is het belangrijk dat u goed begrijpt wat deze studie inhoudt. Daarom vragen wij u om deze informatie aandachtig door te lezen. </w:t>
       </w:r>
-      <w:proofErr w:type="gramStart"/>
-      <w:r>
-        <w:rPr>
-          <w:color w:val="24303B"/>
-          <w:sz w:val="20"/>
-          <w:szCs w:val="20"/>
-        </w:rPr>
-        <w:t>Indien</w:t>
-      </w:r>
-      <w:proofErr w:type="gramEnd"/>
+      <w:r>
+        <w:rPr>
+          <w:color w:val="24303B"/>
+          <w:sz w:val="20"/>
+          <w:szCs w:val="20"/>
+        </w:rPr>
+        <w:t>Als</w:t>
+      </w:r>
       <w:r>
         <w:rPr>
           <w:color w:val="24303B"/>
@@ -1603,6 +1608,7 @@
         <w:jc w:val="both"/>
         <w:textAlignment w:val="baseline"/>
         <w:rPr>
+          <w:rStyle w:val="normaltextrun"/>
           <w:sz w:val="20"/>
           <w:szCs w:val="20"/>
         </w:rPr>
@@ -1631,80 +1637,6 @@
         </w:rPr>
         <w:t xml:space="preserve"> in België. De hoofdonderzoeker van de studie is Prof. Dr. Kevin Deschamps. De lokale uitvoering gebeurt onder verantwoordelijkheid van de onderzoeker in uw ziekenhuis.</w:t>
       </w:r>
-    </w:p>
-    <w:p>
-      <w:pPr>
-        <w:pStyle w:val="paragraph"/>
-        <w:spacing w:before="0" w:beforeAutospacing="0" w:after="0" w:afterAutospacing="0"/>
-        <w:jc w:val="both"/>
-        <w:textAlignment w:val="baseline"/>
-        <w:rPr>
-          <w:rStyle w:val="normaltextrun"/>
-          <w:sz w:val="20"/>
-          <w:szCs w:val="20"/>
-        </w:rPr>
-      </w:pPr>
-    </w:p>
-    <w:p>
-      <w:pPr>
-        <w:pStyle w:val="paragraph"/>
-        <w:spacing w:before="0" w:beforeAutospacing="0" w:after="0" w:afterAutospacing="0"/>
-        <w:jc w:val="both"/>
-        <w:textAlignment w:val="baseline"/>
-        <w:rPr>
-          <w:rStyle w:val="normaltextrun"/>
-          <w:sz w:val="20"/>
-          <w:szCs w:val="20"/>
-        </w:rPr>
-      </w:pPr>
-    </w:p>
-    <w:p>
-      <w:pPr>
-        <w:pStyle w:val="paragraph"/>
-        <w:spacing w:before="0" w:beforeAutospacing="0" w:after="0" w:afterAutospacing="0"/>
-        <w:jc w:val="both"/>
-        <w:textAlignment w:val="baseline"/>
-        <w:rPr>
-          <w:rStyle w:val="normaltextrun"/>
-          <w:sz w:val="20"/>
-          <w:szCs w:val="20"/>
-        </w:rPr>
-      </w:pPr>
-    </w:p>
-    <w:p>
-      <w:pPr>
-        <w:pStyle w:val="paragraph"/>
-        <w:numPr>
-          <w:ilvl w:val="0"/>
-          <w:numId w:val="18"/>
-        </w:numPr>
-        <w:spacing w:before="0" w:beforeAutospacing="0" w:after="0" w:afterAutospacing="0"/>
-        <w:ind w:left="0" w:firstLine="0"/>
-        <w:jc w:val="both"/>
-        <w:textAlignment w:val="baseline"/>
-        <w:rPr>
-          <w:rStyle w:val="normaltextrun"/>
-          <w:sz w:val="20"/>
-          <w:szCs w:val="20"/>
-        </w:rPr>
-      </w:pPr>
-    </w:p>
-    <w:p>
-      <w:pPr>
-        <w:pStyle w:val="paragraph"/>
-        <w:numPr>
-          <w:ilvl w:val="0"/>
-          <w:numId w:val="18"/>
-        </w:numPr>
-        <w:spacing w:before="0" w:beforeAutospacing="0" w:after="0" w:afterAutospacing="0"/>
-        <w:jc w:val="both"/>
-        <w:textAlignment w:val="baseline"/>
-        <w:rPr>
-          <w:rStyle w:val="normaltextrun"/>
-          <w:sz w:val="20"/>
-          <w:szCs w:val="20"/>
-        </w:rPr>
-      </w:pPr>
     </w:p>
     <w:p>
       <w:pPr>
@@ -1786,16 +1718,6 @@
         </w:rPr>
         <w:br/>
       </w:r>
-    </w:p>
-    <w:p>
-      <w:pPr>
-        <w:pStyle w:val="Lijstalinea"/>
-        <w:rPr>
-          <w:b/>
-          <w:bCs/>
-          <w:lang w:val="nl-BE"/>
-        </w:rPr>
-      </w:pPr>
     </w:p>
     <w:p>
       <w:pPr>
@@ -2312,18 +2234,7 @@
               <w:jc w:val="both"/>
               <w:textAlignment w:val="baseline"/>
               <w:rPr>
-                <w:sz w:val="20"/>
-                <w:szCs w:val="20"/>
-              </w:rPr>
-            </w:pPr>
-          </w:p>
-          <w:p>
-            <w:pPr>
-              <w:pStyle w:val="paragraph"/>
-              <w:spacing w:before="0" w:beforeAutospacing="0" w:after="0" w:afterAutospacing="0"/>
-              <w:jc w:val="both"/>
-              <w:textAlignment w:val="baseline"/>
-              <w:rPr>
+                <w:color w:val="FF0000"/>
                 <w:sz w:val="20"/>
                 <w:szCs w:val="20"/>
               </w:rPr>
@@ -2369,27 +2280,7 @@
               <w:textAlignment w:val="baseline"/>
               <w:rPr>
                 <w:rStyle w:val="eop"/>
-                <w:sz w:val="20"/>
-                <w:szCs w:val="20"/>
-              </w:rPr>
-            </w:pPr>
-            <w:r>
-              <w:rPr>
-                <w:rStyle w:val="eop"/>
-                <w:color w:val="24303B"/>
-                <w:sz w:val="20"/>
-                <w:szCs w:val="20"/>
-              </w:rPr>
-              <w:t> </w:t>
-            </w:r>
-          </w:p>
-          <w:p>
-            <w:pPr>
-              <w:pStyle w:val="paragraph"/>
-              <w:spacing w:before="0" w:beforeAutospacing="0" w:after="0" w:afterAutospacing="0"/>
-              <w:jc w:val="both"/>
-              <w:textAlignment w:val="baseline"/>
-              <w:rPr>
+                <w:color w:val="EE0000"/>
                 <w:sz w:val="20"/>
                 <w:szCs w:val="20"/>
               </w:rPr>
@@ -2401,7 +2292,6 @@
               <w:spacing w:before="0" w:beforeAutospacing="0" w:after="0" w:afterAutospacing="0"/>
               <w:textAlignment w:val="baseline"/>
               <w:rPr>
-                <w:rStyle w:val="normaltextrun"/>
                 <w:color w:val="1D8DB0"/>
                 <w:sz w:val="20"/>
                 <w:szCs w:val="20"/>
@@ -2446,75 +2336,11 @@
             </w:r>
             <w:proofErr w:type="gramEnd"/>
           </w:p>
-          <w:p>
-            <w:pPr>
-              <w:pStyle w:val="paragraph"/>
-              <w:spacing w:before="0" w:beforeAutospacing="0" w:after="0" w:afterAutospacing="0"/>
-              <w:jc w:val="both"/>
-              <w:textAlignment w:val="baseline"/>
-              <w:rPr>
-                <w:sz w:val="20"/>
-                <w:szCs w:val="20"/>
-              </w:rPr>
-            </w:pPr>
-          </w:p>
-          <w:p>
-            <w:pPr>
-              <w:pStyle w:val="paragraph"/>
-              <w:spacing w:before="0" w:beforeAutospacing="0" w:after="0" w:afterAutospacing="0"/>
-              <w:jc w:val="both"/>
-              <w:textAlignment w:val="baseline"/>
-              <w:rPr>
-                <w:sz w:val="20"/>
-                <w:szCs w:val="20"/>
-              </w:rPr>
-            </w:pPr>
-          </w:p>
         </w:tc>
       </w:tr>
     </w:tbl>
     <w:p>
       <w:pPr>
-        <w:pStyle w:val="paragraph"/>
-        <w:spacing w:before="0" w:beforeAutospacing="0" w:after="0" w:afterAutospacing="0"/>
-        <w:jc w:val="both"/>
-        <w:textAlignment w:val="baseline"/>
-        <w:rPr>
-          <w:sz w:val="20"/>
-          <w:szCs w:val="20"/>
-        </w:rPr>
-      </w:pPr>
-    </w:p>
-    <w:p>
-      <w:pPr>
-        <w:pStyle w:val="paragraph"/>
-        <w:spacing w:before="0" w:beforeAutospacing="0" w:after="0" w:afterAutospacing="0"/>
-        <w:textAlignment w:val="baseline"/>
-        <w:rPr>
-          <w:rStyle w:val="normaltextrun"/>
-          <w:sz w:val="20"/>
-          <w:szCs w:val="20"/>
-        </w:rPr>
-      </w:pPr>
-    </w:p>
-    <w:p>
-      <w:pPr>
-        <w:autoSpaceDE w:val="0"/>
-        <w:autoSpaceDN w:val="0"/>
-        <w:adjustRightInd w:val="0"/>
-        <w:spacing w:after="120"/>
-        <w:jc w:val="both"/>
-        <w:rPr>
-          <w:bCs/>
-          <w:color w:val="000000"/>
-          <w:sz w:val="20"/>
-          <w:szCs w:val="20"/>
-          <w:lang/>
-        </w:rPr>
-      </w:pPr>
-    </w:p>
-    <w:p>
-      <w:pPr>
         <w:pStyle w:val="Kop3"/>
         <w:rPr>
           <w:lang w:val="nl-BE"/>
@@ -2525,6 +2351,7 @@
           <w:color w:val="24303B"/>
           <w:lang w:val="nl-BE"/>
         </w:rPr>
+        <w:lastRenderedPageBreak/>
         <w:t>3. Achtergrond en doelstelling van de studie</w:t>
       </w:r>
     </w:p>
@@ -2761,7 +2588,6 @@
         </w:rPr>
         <w:t xml:space="preserve">Wat houdt deelname aan de studie in voor </w:t>
       </w:r>
-      <w:proofErr w:type="gramStart"/>
       <w:r>
         <w:rPr>
           <w:color w:val="24303B"/>
@@ -2769,14 +2595,6 @@
         </w:rPr>
         <w:t>u?</w:t>
       </w:r>
-      <w:r>
-        <w:rPr>
-          <w:color w:val="24303B"/>
-          <w:lang w:val="nl-BE"/>
-        </w:rPr>
-        <w:t>:</w:t>
-      </w:r>
-      <w:proofErr w:type="gramEnd"/>
     </w:p>
     <w:p>
       <w:pPr>
@@ -3009,7 +2827,6 @@
         </w:rPr>
         <w:t xml:space="preserve"> (+/- </w:t>
       </w:r>
-      <w:proofErr w:type="gramStart"/>
       <w:r>
         <w:rPr>
           <w:b/>
@@ -3019,9 +2836,8 @@
           <w:szCs w:val="20"/>
           <w:lang w:val="nl-NL"/>
         </w:rPr>
-        <w:t>3 maandelijks</w:t>
-      </w:r>
-      <w:proofErr w:type="gramEnd"/>
+        <w:t>3-maandelijks</w:t>
+      </w:r>
       <w:r>
         <w:rPr>
           <w:color w:val="24303B"/>
@@ -3108,7 +2924,6 @@
         </w:rPr>
         <w:t xml:space="preserve">klein toestel dragen </w:t>
       </w:r>
-      <w:proofErr w:type="gramStart"/>
       <w:r>
         <w:rPr>
           <w:color w:val="24303B"/>
@@ -3116,7 +2931,7 @@
           <w:szCs w:val="20"/>
           <w:lang w:val="nl-NL"/>
         </w:rPr>
-        <w:t xml:space="preserve">om  </w:t>
+        <w:t>om uw</w:t>
       </w:r>
       <w:r>
         <w:rPr>
@@ -3124,43 +2939,74 @@
           <w:szCs w:val="20"/>
           <w:lang w:val="nl-NL"/>
         </w:rPr>
-        <w:t>uw</w:t>
-      </w:r>
-      <w:proofErr w:type="gramEnd"/>
+        <w:t xml:space="preserve"> </w:t>
+      </w:r>
       <w:r>
         <w:rPr>
           <w:sz w:val="20"/>
           <w:szCs w:val="20"/>
           <w:lang w:val="nl-NL"/>
         </w:rPr>
+        <w:t>activiteiten (</w:t>
+      </w:r>
+      <w:r>
+        <w:rPr>
+          <w:sz w:val="20"/>
+          <w:szCs w:val="20"/>
+          <w:lang w:val="nl-NL"/>
+        </w:rPr>
+        <w:t xml:space="preserve">bv. </w:t>
+      </w:r>
+      <w:r>
+        <w:rPr>
+          <w:sz w:val="20"/>
+          <w:szCs w:val="20"/>
+          <w:lang w:val="nl-NL"/>
+        </w:rPr>
+        <w:t>t</w:t>
+      </w:r>
+      <w:r>
+        <w:rPr>
+          <w:sz w:val="20"/>
+          <w:szCs w:val="20"/>
+          <w:lang w:val="nl-NL"/>
+        </w:rPr>
+        <w:t>raplopen, stappen, zitten)</w:t>
+      </w:r>
+      <w:r>
+        <w:rPr>
+          <w:sz w:val="20"/>
+          <w:szCs w:val="20"/>
+          <w:lang w:val="nl-NL"/>
+        </w:rPr>
         <w:t xml:space="preserve"> </w:t>
       </w:r>
-      <w:proofErr w:type="gramStart"/>
-      <w:r>
-        <w:rPr>
+      <w:r>
+        <w:rPr>
+          <w:color w:val="24303B"/>
           <w:sz w:val="20"/>
           <w:szCs w:val="20"/>
           <w:lang w:val="nl-NL"/>
         </w:rPr>
-        <w:t>activiteiten  (</w:t>
-      </w:r>
-      <w:proofErr w:type="gramEnd"/>
-      <w:r>
-        <w:rPr>
+        <w:t xml:space="preserve">te </w:t>
+      </w:r>
+      <w:r>
+        <w:rPr>
+          <w:color w:val="24303B"/>
           <w:sz w:val="20"/>
           <w:szCs w:val="20"/>
           <w:lang w:val="nl-NL"/>
         </w:rPr>
-        <w:t xml:space="preserve">bv. Traplopen, stappen, </w:t>
-      </w:r>
-      <w:proofErr w:type="gramStart"/>
-      <w:r>
-        <w:rPr>
+        <w:t>meten.</w:t>
+      </w:r>
+      <w:r>
+        <w:rPr>
+          <w:color w:val="24303B"/>
           <w:sz w:val="20"/>
           <w:szCs w:val="20"/>
           <w:lang w:val="nl-NL"/>
         </w:rPr>
-        <w:t>zitten)</w:t>
+        <w:t xml:space="preserve"> </w:t>
       </w:r>
       <w:r>
         <w:rPr>
@@ -3169,71 +3015,7 @@
           <w:szCs w:val="20"/>
           <w:lang w:val="nl-NL"/>
         </w:rPr>
-        <w:t>te</w:t>
-      </w:r>
-      <w:proofErr w:type="gramEnd"/>
-      <w:r>
-        <w:rPr>
-          <w:color w:val="24303B"/>
-          <w:sz w:val="20"/>
-          <w:szCs w:val="20"/>
-          <w:lang w:val="nl-NL"/>
-        </w:rPr>
-        <w:t xml:space="preserve"> </w:t>
-      </w:r>
-      <w:proofErr w:type="gramStart"/>
-      <w:r>
-        <w:rPr>
-          <w:color w:val="24303B"/>
-          <w:sz w:val="20"/>
-          <w:szCs w:val="20"/>
-          <w:lang w:val="nl-NL"/>
-        </w:rPr>
-        <w:t>meten</w:t>
-      </w:r>
-      <w:r>
-        <w:rPr>
-          <w:sz w:val="20"/>
-          <w:szCs w:val="20"/>
-          <w:lang w:val="nl-NL"/>
-        </w:rPr>
-        <w:t xml:space="preserve"> </w:t>
-      </w:r>
-      <w:r>
-        <w:rPr>
-          <w:color w:val="24303B"/>
-          <w:sz w:val="20"/>
-          <w:szCs w:val="20"/>
-          <w:lang w:val="nl-NL"/>
-        </w:rPr>
-        <w:t>.</w:t>
-      </w:r>
-      <w:proofErr w:type="gramEnd"/>
-      <w:r>
-        <w:rPr>
-          <w:color w:val="24303B"/>
-          <w:sz w:val="20"/>
-          <w:szCs w:val="20"/>
-          <w:lang w:val="nl-NL"/>
-        </w:rPr>
-        <w:t xml:space="preserve"> Daarnaast krijgt u persoonlijke begeleiding en educatie over voetverzorging en het correct gebruik van uw schoeisel. U zal ook feedback krijgen over uw gebruik van het schoeisel, zodat eventuele problemen samen met </w:t>
-      </w:r>
-      <w:r>
-        <w:rPr>
-          <w:sz w:val="20"/>
-          <w:szCs w:val="20"/>
-          <w:lang w:val="nl-NL"/>
-        </w:rPr>
-        <w:t>uw</w:t>
-      </w:r>
-      <w:r>
-        <w:rPr>
-          <w:color w:val="24303B"/>
-          <w:sz w:val="20"/>
-          <w:szCs w:val="20"/>
-          <w:lang w:val="nl-NL"/>
-        </w:rPr>
-        <w:t xml:space="preserve"> zorgverlener kunnen worden aangepakt.</w:t>
+        <w:t xml:space="preserve">Daarnaast krijgt u persoonlijke begeleiding en educatie over voetverzorging en het correct gebruik van uw schoeisel. </w:t>
       </w:r>
     </w:p>
     <w:p>
@@ -3248,7 +3030,6 @@
           <w:color w:val="24303B"/>
           <w:lang w:val="nl-BE"/>
         </w:rPr>
-        <w:lastRenderedPageBreak/>
         <w:t xml:space="preserve">5. </w:t>
       </w:r>
       <w:r>
@@ -3340,7 +3121,7 @@
           <w:color w:val="000000"/>
           <w:sz w:val="20"/>
           <w:szCs w:val="20"/>
-          <w:lang/>
+          <w:lang w:val="nl-BE"/>
         </w:rPr>
       </w:pPr>
       <w:r>
@@ -3349,7 +3130,7 @@
           <w:color w:val="000000"/>
           <w:sz w:val="20"/>
           <w:szCs w:val="20"/>
-          <w:lang/>
+          <w:lang w:val="nl-BE"/>
         </w:rPr>
         <w:br w:type="page"/>
       </w:r>
@@ -3618,134 +3399,100 @@
     </w:p>
     <w:p>
       <w:pPr>
+        <w:spacing w:before="240" w:after="240"/>
+        <w:jc w:val="both"/>
+        <w:rPr>
+          <w:sz w:val="20"/>
+          <w:szCs w:val="20"/>
+          <w:lang w:val="nl-BE"/>
+        </w:rPr>
+      </w:pPr>
+      <w:r>
+        <w:rPr>
+          <w:sz w:val="20"/>
+          <w:szCs w:val="20"/>
+          <w:lang w:val="nl-BE"/>
+        </w:rPr>
+        <w:t>Daarna wordt de druk onder uw voeten gemeten. Dit gebeurt terwijl u blootsvoets stapt op een speciale meetplaat (Figuur 1). Deze metingen tonen op welke plaatsen onder uw voet meer druk ontstaat. De resultaten helpen om uw steunzolen zo goed mogelijk aan te passen.</w:t>
+      </w:r>
+    </w:p>
+    <w:p>
+      <w:pPr>
+        <w:spacing w:before="240" w:after="240"/>
+        <w:jc w:val="both"/>
+        <w:rPr>
+          <w:sz w:val="20"/>
+          <w:szCs w:val="20"/>
+          <w:lang w:val="nl-BE"/>
+        </w:rPr>
+      </w:pPr>
+      <w:r>
+        <w:rPr>
+          <w:sz w:val="20"/>
+          <w:szCs w:val="20"/>
+          <w:lang w:val="nl-BE"/>
+        </w:rPr>
+        <w:t>Tijdens een volgend bezoek worden uw steunzolen aangemeten (Figuur 2). We controleren of deze goed passen en comfortabel zitten. Vervolgens meten we opnieuw de druk onder uw voeten terwijl u uw eigen schoenen draagt, met en zonder de steunzolen. Indien nodig worden uw steunzolen of schoeisel aangepast om de druk onder uw voeten zoveel mogelijk te verminderen.</w:t>
+      </w:r>
+    </w:p>
+    <w:p>
+      <w:pPr>
+        <w:spacing w:before="281" w:after="281"/>
+        <w:jc w:val="both"/>
+        <w:rPr>
+          <w:b/>
+          <w:bCs/>
+          <w:sz w:val="20"/>
+          <w:szCs w:val="20"/>
+          <w:lang w:val="nl-BE"/>
+        </w:rPr>
+      </w:pPr>
+      <w:r>
+        <w:rPr>
+          <w:b/>
+          <w:bCs/>
+          <w:sz w:val="20"/>
+          <w:szCs w:val="20"/>
+          <w:lang w:val="nl-BE"/>
+        </w:rPr>
+        <w:t>Meting van het gebruik van uw schoeisel</w:t>
+      </w:r>
+    </w:p>
+    <w:p>
+      <w:pPr>
+        <w:spacing w:before="281" w:after="281"/>
+        <w:jc w:val="both"/>
+        <w:rPr>
+          <w:sz w:val="20"/>
+          <w:szCs w:val="20"/>
+          <w:lang w:val="nl-BE"/>
+        </w:rPr>
+      </w:pPr>
+      <w:r>
+        <w:rPr>
+          <w:sz w:val="20"/>
+          <w:szCs w:val="20"/>
+          <w:lang w:val="nl-BE"/>
+        </w:rPr>
+        <w:t>Bij alle deelnemers wordt een kleine sensor in de steunzool geplaatst (Figuur 3). Deze sensor registreert automatisch hoe vaak en hoe lang u uw schoeisel draagt. U hoeft hiervoor zelf niets te doen. De gegevens helpen ons om beter te begrijpen hoe het schoeisel in het dagelijks leven wordt gebruikt.</w:t>
+      </w:r>
+    </w:p>
+    <w:p>
+      <w:pPr>
         <w:spacing w:before="100" w:beforeAutospacing="1" w:after="100" w:afterAutospacing="1"/>
         <w:jc w:val="both"/>
         <w:rPr>
+          <w:sz w:val="20"/>
+          <w:szCs w:val="20"/>
+          <w:lang w:val="nl-BE"/>
+        </w:rPr>
+      </w:pPr>
+      <w:r>
+        <w:rPr>
+          <w:noProof/>
+          <w:color w:val="24303B"/>
           <w:sz w:val="18"/>
           <w:szCs w:val="18"/>
-          <w:lang w:val="nl-BE" w:eastAsia="en-US"/>
-        </w:rPr>
-      </w:pPr>
-    </w:p>
-    <w:p>
-      <w:pPr>
-        <w:spacing w:before="240" w:after="240"/>
-        <w:jc w:val="both"/>
-        <w:rPr>
-          <w:sz w:val="20"/>
-          <w:szCs w:val="20"/>
-          <w:lang w:val="nl-BE"/>
-        </w:rPr>
-      </w:pPr>
-      <w:r>
-        <w:rPr>
-          <w:sz w:val="20"/>
-          <w:szCs w:val="20"/>
-          <w:lang w:val="nl-BE"/>
-        </w:rPr>
-        <w:t>Daarna wordt de druk onder uw voeten gemeten. Dit gebeurt terwijl u blootsvoets stapt op een speciale meetplaat (Figuur 1). Deze metingen tonen op welke plaatsen onder uw voet meer druk ontstaat. De resultaten helpen om uw steunzolen zo goed mogelijk aan te passen.</w:t>
-      </w:r>
-    </w:p>
-    <w:p>
-      <w:pPr>
-        <w:spacing w:before="240" w:after="240"/>
-        <w:jc w:val="both"/>
-        <w:rPr>
-          <w:sz w:val="20"/>
-          <w:szCs w:val="20"/>
-          <w:lang w:val="nl-BE"/>
-        </w:rPr>
-      </w:pPr>
-      <w:r>
-        <w:rPr>
-          <w:sz w:val="20"/>
-          <w:szCs w:val="20"/>
-          <w:lang w:val="nl-BE"/>
-        </w:rPr>
-        <w:t>Tijdens een volgend bezoek worden uw steunzolen aangemeten (Figuur 2). We controleren of deze goed passen en comfortabel zitten. Vervolgens meten we opnieuw de druk onder uw voeten terwijl u uw eigen schoenen draagt, met en zonder de steunzolen. Indien nodig worden uw steunzolen of schoeisel aangepast om de druk onder uw voeten zoveel mogelijk te verminderen.</w:t>
-      </w:r>
-    </w:p>
-    <w:p>
-      <w:pPr>
-        <w:spacing w:beforeAutospacing="1" w:afterAutospacing="1"/>
-        <w:jc w:val="both"/>
-        <w:rPr>
-          <w:sz w:val="20"/>
-          <w:szCs w:val="20"/>
-          <w:lang w:val="nl-BE" w:eastAsia="en-US"/>
-        </w:rPr>
-      </w:pPr>
-    </w:p>
-    <w:p>
-      <w:pPr>
-        <w:spacing w:before="281" w:after="281"/>
-        <w:jc w:val="both"/>
-        <w:rPr>
-          <w:b/>
-          <w:bCs/>
-          <w:sz w:val="20"/>
-          <w:szCs w:val="20"/>
-          <w:lang w:val="nl-BE"/>
-        </w:rPr>
-      </w:pPr>
-      <w:r>
-        <w:rPr>
-          <w:b/>
-          <w:bCs/>
-          <w:sz w:val="20"/>
-          <w:szCs w:val="20"/>
-          <w:lang w:val="nl-BE"/>
-        </w:rPr>
-        <w:t>Meting van het gebruik van uw schoeisel</w:t>
-      </w:r>
-    </w:p>
-    <w:p>
-      <w:pPr>
-        <w:spacing w:before="281" w:after="281"/>
-        <w:jc w:val="both"/>
-        <w:rPr>
-          <w:sz w:val="20"/>
-          <w:szCs w:val="20"/>
-          <w:lang w:val="nl-BE"/>
-        </w:rPr>
-      </w:pPr>
-      <w:r>
-        <w:rPr>
-          <w:sz w:val="20"/>
-          <w:szCs w:val="20"/>
-          <w:lang w:val="nl-BE"/>
-        </w:rPr>
-        <w:t>Bij alle deelnemers wordt een kleine sensor in de steunzool geplaatst (Figuur 3). Deze sensor registreert automatisch hoe vaak en hoe lang u uw schoeisel draagt. U hoeft hiervoor zelf niets te doen. De gegevens helpen ons om beter te begrijpen hoe het schoeisel in het dagelijks leven wordt gebruikt.</w:t>
-      </w:r>
-    </w:p>
-    <w:p>
-      <w:pPr>
-        <w:spacing w:beforeAutospacing="1" w:afterAutospacing="1"/>
-        <w:jc w:val="both"/>
-        <w:rPr>
-          <w:sz w:val="20"/>
-          <w:szCs w:val="20"/>
-          <w:lang w:val="nl-BE" w:eastAsia="en-US"/>
-        </w:rPr>
-      </w:pPr>
-    </w:p>
-    <w:p>
-      <w:pPr>
-        <w:spacing w:before="100" w:beforeAutospacing="1" w:after="100" w:afterAutospacing="1"/>
-        <w:jc w:val="both"/>
-        <w:rPr>
-          <w:sz w:val="20"/>
-          <w:szCs w:val="20"/>
-          <w:lang/>
-        </w:rPr>
-      </w:pPr>
-      <w:r>
-        <w:rPr>
-          <w:noProof/>
-          <w:color w:val="24303B"/>
-          <w:sz w:val="18"/>
-          <w:szCs w:val="18"/>
-          <w:lang/>
         </w:rPr>
         <w:drawing>
           <wp:anchor distT="0" distB="0" distL="114300" distR="114300" simplePos="0" relativeHeight="251665920" behindDoc="0" locked="0" layoutInCell="1" allowOverlap="1" wp14:anchorId="6D37E481" wp14:editId="3B42224C">
@@ -3773,7 +3520,7 @@
                     </pic:cNvPicPr>
                   </pic:nvPicPr>
                   <pic:blipFill>
-                    <a:blip r:embed="rId19" cstate="print">
+                    <a:blip r:embed="rId21" cstate="print">
                       <a:extLst>
                         <a:ext uri="{28A0092B-C50C-407E-A947-70E740481C1C}">
                           <a14:useLocalDpi xmlns:a14="http://schemas.microsoft.com/office/drawing/2010/main" val="0"/>
@@ -3813,7 +3560,6 @@
           <w:color w:val="24303B"/>
           <w:sz w:val="20"/>
           <w:szCs w:val="20"/>
-          <w:lang/>
         </w:rPr>
         <w:drawing>
           <wp:anchor distT="0" distB="0" distL="114300" distR="114300" simplePos="0" relativeHeight="251662848" behindDoc="0" locked="0" layoutInCell="1" allowOverlap="1" wp14:anchorId="3F31C544" wp14:editId="5B2BCF08">
@@ -3841,7 +3587,7 @@
                     </pic:cNvPicPr>
                   </pic:nvPicPr>
                   <pic:blipFill>
-                    <a:blip r:embed="rId20">
+                    <a:blip r:embed="rId22">
                       <a:extLst>
                         <a:ext uri="{28A0092B-C50C-407E-A947-70E740481C1C}">
                           <a14:useLocalDpi xmlns:a14="http://schemas.microsoft.com/office/drawing/2010/main" val="0"/>
@@ -3914,7 +3660,7 @@
                     </pic:cNvPicPr>
                   </pic:nvPicPr>
                   <pic:blipFill>
-                    <a:blip r:embed="rId21" cstate="print">
+                    <a:blip r:embed="rId23" cstate="print">
                       <a:extLst>
                         <a:ext uri="{28A0092B-C50C-407E-A947-70E740481C1C}">
                           <a14:useLocalDpi xmlns:a14="http://schemas.microsoft.com/office/drawing/2010/main" val="0"/>
@@ -3996,6 +3742,7 @@
         <w:spacing w:before="100" w:beforeAutospacing="1" w:after="100" w:afterAutospacing="1"/>
         <w:jc w:val="both"/>
         <w:rPr>
+          <w:color w:val="24303B"/>
           <w:sz w:val="18"/>
           <w:szCs w:val="18"/>
           <w:lang w:val="nl-BE" w:eastAsia="en-US"/>
@@ -4030,36 +3777,32 @@
           <w:szCs w:val="18"/>
           <w:lang w:val="nl-BE" w:eastAsia="en-US"/>
         </w:rPr>
-        <w:t>. Drukmeting onder de voeten.</w:t>
-      </w:r>
-      <w:r>
-        <w:rPr>
-          <w:color w:val="24303B"/>
-          <w:lang w:val="nl-BE"/>
-        </w:rPr>
-        <w:tab/>
-      </w:r>
-      <w:r>
-        <w:rPr>
-          <w:b/>
-          <w:bCs/>
+        <w:t xml:space="preserve">. Drukmeting </w:t>
+      </w:r>
+      <w:r>
+        <w:rPr>
           <w:color w:val="24303B"/>
           <w:sz w:val="18"/>
           <w:szCs w:val="18"/>
           <w:lang w:val="nl-BE" w:eastAsia="en-US"/>
         </w:rPr>
-        <w:t xml:space="preserve">Figuur </w:t>
-      </w:r>
-      <w:r>
-        <w:rPr>
-          <w:b/>
-          <w:bCs/>
+        <w:t>in de schoen</w:t>
+      </w:r>
+      <w:r>
+        <w:rPr>
           <w:color w:val="24303B"/>
           <w:sz w:val="18"/>
           <w:szCs w:val="18"/>
           <w:lang w:val="nl-BE" w:eastAsia="en-US"/>
         </w:rPr>
-        <w:t>2</w:t>
+        <w:t>.</w:t>
+      </w:r>
+      <w:r>
+        <w:rPr>
+          <w:color w:val="24303B"/>
+          <w:lang w:val="nl-BE"/>
+        </w:rPr>
+        <w:tab/>
       </w:r>
       <w:r>
         <w:rPr>
@@ -4070,54 +3813,54 @@
           <w:szCs w:val="18"/>
           <w:lang w:val="nl-BE" w:eastAsia="en-US"/>
         </w:rPr>
-        <w:t>.</w:t>
-      </w:r>
-      <w:r>
-        <w:rPr>
+        <w:t xml:space="preserve">Figuur </w:t>
+      </w:r>
+      <w:r>
+        <w:rPr>
+          <w:b/>
+          <w:bCs/>
           <w:color w:val="24303B"/>
           <w:sz w:val="18"/>
           <w:szCs w:val="18"/>
           <w:lang w:val="nl-BE" w:eastAsia="en-US"/>
         </w:rPr>
-        <w:t xml:space="preserve"> Steunzool</w:t>
-      </w:r>
-      <w:r>
-        <w:rPr>
-          <w:color w:val="24303B"/>
-          <w:lang w:val="nl-BE"/>
-        </w:rPr>
-        <w:tab/>
-      </w:r>
-      <w:r>
-        <w:rPr>
+        <w:t>2</w:t>
+      </w:r>
+      <w:r>
+        <w:rPr>
+          <w:b/>
+          <w:bCs/>
           <w:color w:val="24303B"/>
           <w:sz w:val="18"/>
           <w:szCs w:val="18"/>
           <w:lang w:val="nl-BE" w:eastAsia="en-US"/>
         </w:rPr>
-        <w:t xml:space="preserve">    </w:t>
-      </w:r>
-      <w:r>
-        <w:rPr>
-          <w:b/>
-          <w:bCs/>
+        <w:t>.</w:t>
+      </w:r>
+      <w:r>
+        <w:rPr>
           <w:color w:val="24303B"/>
           <w:sz w:val="18"/>
           <w:szCs w:val="18"/>
           <w:lang w:val="nl-BE" w:eastAsia="en-US"/>
         </w:rPr>
-        <w:t xml:space="preserve">Figuur </w:t>
-      </w:r>
-      <w:r>
-        <w:rPr>
-          <w:b/>
-          <w:bCs/>
+        <w:t xml:space="preserve"> </w:t>
+      </w:r>
+      <w:r>
+        <w:rPr>
           <w:color w:val="24303B"/>
           <w:sz w:val="18"/>
           <w:szCs w:val="18"/>
           <w:lang w:val="nl-BE" w:eastAsia="en-US"/>
         </w:rPr>
-        <w:t>3</w:t>
+        <w:t>Steunzool op maat</w:t>
+      </w:r>
+      <w:r>
+        <w:rPr>
+          <w:color w:val="24303B"/>
+          <w:lang w:val="nl-BE"/>
+        </w:rPr>
+        <w:tab/>
       </w:r>
       <w:r>
         <w:rPr>
@@ -4126,17 +3869,79 @@
           <w:szCs w:val="18"/>
           <w:lang w:val="nl-BE" w:eastAsia="en-US"/>
         </w:rPr>
-        <w:t xml:space="preserve">. </w:t>
-      </w:r>
-      <w:r>
-        <w:rPr>
+        <w:t xml:space="preserve">    </w:t>
+      </w:r>
+      <w:r>
+        <w:rPr>
+          <w:b/>
+          <w:bCs/>
           <w:color w:val="24303B"/>
           <w:sz w:val="18"/>
           <w:szCs w:val="18"/>
           <w:lang w:val="nl-BE" w:eastAsia="en-US"/>
         </w:rPr>
-        <w:t>Op maat gemaakte steunzool</w:t>
-      </w:r>
+        <w:t>Figuur</w:t>
+      </w:r>
+      <w:r>
+        <w:rPr>
+          <w:b/>
+          <w:bCs/>
+          <w:color w:val="24303B"/>
+          <w:sz w:val="18"/>
+          <w:szCs w:val="18"/>
+          <w:lang w:val="nl-BE" w:eastAsia="en-US"/>
+        </w:rPr>
+        <w:t xml:space="preserve"> </w:t>
+      </w:r>
+      <w:r>
+        <w:rPr>
+          <w:b/>
+          <w:bCs/>
+          <w:color w:val="24303B"/>
+          <w:sz w:val="18"/>
+          <w:szCs w:val="18"/>
+          <w:lang w:val="nl-BE" w:eastAsia="en-US"/>
+        </w:rPr>
+        <w:t>3</w:t>
+      </w:r>
+      <w:r>
+        <w:rPr>
+          <w:color w:val="24303B"/>
+          <w:sz w:val="18"/>
+          <w:szCs w:val="18"/>
+          <w:lang w:val="nl-BE" w:eastAsia="en-US"/>
+        </w:rPr>
+        <w:t xml:space="preserve">. </w:t>
+      </w:r>
+      <w:r>
+        <w:rPr>
+          <w:color w:val="24303B"/>
+          <w:sz w:val="18"/>
+          <w:szCs w:val="18"/>
+          <w:lang w:val="nl-BE" w:eastAsia="en-US"/>
+        </w:rPr>
+        <w:t>D</w:t>
+      </w:r>
+      <w:r>
+        <w:rPr>
+          <w:color w:val="24303B"/>
+          <w:sz w:val="18"/>
+          <w:szCs w:val="18"/>
+          <w:lang w:val="nl-BE" w:eastAsia="en-US"/>
+        </w:rPr>
+        <w:t>raagsensor</w:t>
+      </w:r>
+    </w:p>
+    <w:p>
+      <w:pPr>
+        <w:spacing w:before="100" w:beforeAutospacing="1" w:after="100" w:afterAutospacing="1"/>
+        <w:jc w:val="both"/>
+        <w:rPr>
+          <w:sz w:val="18"/>
+          <w:szCs w:val="18"/>
+          <w:lang w:val="nl-BE" w:eastAsia="en-US"/>
+        </w:rPr>
+      </w:pPr>
       <w:r>
         <w:rPr>
           <w:lang w:val="nl-BE"/>
@@ -4181,13 +3986,13 @@
           <w:color w:val="24303B"/>
         </w:rPr>
         <w:drawing>
-          <wp:anchor distT="0" distB="0" distL="114300" distR="114300" simplePos="0" relativeHeight="251666944" behindDoc="0" locked="0" layoutInCell="1" allowOverlap="1" wp14:anchorId="450A6C91" wp14:editId="71E0135F">
+          <wp:anchor distT="0" distB="0" distL="114300" distR="114300" simplePos="0" relativeHeight="251666944" behindDoc="0" locked="0" layoutInCell="1" allowOverlap="1" wp14:anchorId="450A6C91" wp14:editId="79ABA683">
             <wp:simplePos x="0" y="0"/>
             <wp:positionH relativeFrom="margin">
-              <wp:align>right</wp:align>
+              <wp:posOffset>13335</wp:posOffset>
             </wp:positionH>
             <wp:positionV relativeFrom="paragraph">
-              <wp:posOffset>351790</wp:posOffset>
+              <wp:posOffset>742315</wp:posOffset>
             </wp:positionV>
             <wp:extent cx="1661160" cy="1105830"/>
             <wp:effectExtent l="0" t="0" r="0" b="0"/>
@@ -4206,7 +4011,7 @@
                     </pic:cNvPicPr>
                   </pic:nvPicPr>
                   <pic:blipFill>
-                    <a:blip r:embed="rId22">
+                    <a:blip r:embed="rId24">
                       <a:extLst>
                         <a:ext uri="{28A0092B-C50C-407E-A947-70E740481C1C}">
                           <a14:useLocalDpi xmlns:a14="http://schemas.microsoft.com/office/drawing/2010/main" val="0"/>
@@ -4249,7 +4054,25 @@
           <w:szCs w:val="20"/>
           <w:lang w:val="nl-BE"/>
         </w:rPr>
-        <w:t xml:space="preserve"> Op bepaalde momenten tijdens de studie vragen we u om gedurende één week een kleine activiteitssensor te dragen ter hoogte van de onderrug (Figuur 4). Deze sensor meet bijvoorbeeld hoeveel stappen u dagelijks zet. Zo krijgen we een beter beeld van de belasting van uw voeten tijdens uw gewone activiteiten. U kunt het toestel zowel boven als onder uw kleding dragen.</w:t>
+        <w:t xml:space="preserve">Op bepaalde momenten tijdens de studie vragen we u om gedurende één week een kleine </w:t>
+      </w:r>
+      <w:proofErr w:type="spellStart"/>
+      <w:r>
+        <w:rPr>
+          <w:sz w:val="20"/>
+          <w:szCs w:val="20"/>
+          <w:lang w:val="nl-BE"/>
+        </w:rPr>
+        <w:t>activiteitssensor</w:t>
+      </w:r>
+      <w:proofErr w:type="spellEnd"/>
+      <w:r>
+        <w:rPr>
+          <w:sz w:val="20"/>
+          <w:szCs w:val="20"/>
+          <w:lang w:val="nl-BE"/>
+        </w:rPr>
+        <w:t xml:space="preserve"> te dragen ter hoogte van de onderrug (Figuur 4). Deze sensor meet bijvoorbeeld hoeveel stappen u dagelijks zet. Zo krijgen we een beter beeld van de belasting van uw voeten tijdens uw gewone activiteiten. U kunt het toestel zowel boven als onder uw kleding dragen.</w:t>
       </w:r>
       <w:r>
         <w:rPr>
@@ -4265,8 +4088,11 @@
         <w:spacing w:before="100" w:beforeAutospacing="1" w:after="100" w:afterAutospacing="1"/>
         <w:jc w:val="both"/>
         <w:rPr>
-          <w:sz w:val="20"/>
-          <w:szCs w:val="20"/>
+          <w:b/>
+          <w:bCs/>
+          <w:color w:val="24303B"/>
+          <w:sz w:val="18"/>
+          <w:szCs w:val="18"/>
           <w:lang w:val="nl-BE" w:eastAsia="en-US"/>
         </w:rPr>
       </w:pPr>
@@ -4276,7 +4102,51 @@
         <w:spacing w:before="100" w:beforeAutospacing="1" w:after="100" w:afterAutospacing="1"/>
         <w:jc w:val="both"/>
         <w:rPr>
-          <w:lang w:val="nl-BE"/>
+          <w:b/>
+          <w:bCs/>
+          <w:color w:val="24303B"/>
+          <w:sz w:val="18"/>
+          <w:szCs w:val="18"/>
+          <w:lang w:val="nl-BE" w:eastAsia="en-US"/>
+        </w:rPr>
+      </w:pPr>
+    </w:p>
+    <w:p>
+      <w:pPr>
+        <w:spacing w:before="100" w:beforeAutospacing="1" w:after="100" w:afterAutospacing="1"/>
+        <w:jc w:val="both"/>
+        <w:rPr>
+          <w:b/>
+          <w:bCs/>
+          <w:color w:val="24303B"/>
+          <w:sz w:val="18"/>
+          <w:szCs w:val="18"/>
+          <w:lang w:val="nl-BE" w:eastAsia="en-US"/>
+        </w:rPr>
+      </w:pPr>
+    </w:p>
+    <w:p>
+      <w:pPr>
+        <w:spacing w:before="100" w:beforeAutospacing="1" w:after="100" w:afterAutospacing="1"/>
+        <w:jc w:val="both"/>
+        <w:rPr>
+          <w:b/>
+          <w:bCs/>
+          <w:color w:val="24303B"/>
+          <w:sz w:val="18"/>
+          <w:szCs w:val="18"/>
+          <w:lang w:val="nl-BE" w:eastAsia="en-US"/>
+        </w:rPr>
+      </w:pPr>
+    </w:p>
+    <w:p>
+      <w:pPr>
+        <w:spacing w:before="100" w:beforeAutospacing="1" w:after="100" w:afterAutospacing="1"/>
+        <w:rPr>
+          <w:color w:val="24303B"/>
+          <w:sz w:val="18"/>
+          <w:szCs w:val="18"/>
+          <w:lang w:val="nl-BE" w:eastAsia="en-US"/>
         </w:rPr>
       </w:pPr>
       <w:r>
@@ -4307,8 +4177,19 @@
           <w:szCs w:val="18"/>
           <w:lang w:val="nl-BE" w:eastAsia="en-US"/>
         </w:rPr>
-        <w:t>. Activiteitsmonitoring</w:t>
-      </w:r>
+        <w:t xml:space="preserve">. </w:t>
+      </w:r>
+      <w:proofErr w:type="spellStart"/>
+      <w:r>
+        <w:rPr>
+          <w:color w:val="24303B"/>
+          <w:sz w:val="18"/>
+          <w:szCs w:val="18"/>
+          <w:lang w:val="nl-BE" w:eastAsia="en-US"/>
+        </w:rPr>
+        <w:t>Activiteitsmonitoring</w:t>
+      </w:r>
+      <w:proofErr w:type="spellEnd"/>
     </w:p>
     <w:p>
       <w:pPr>
@@ -4332,12 +4213,6 @@
         </w:rPr>
         <w:t>Opvolgbezoeken tijdens de studie</w:t>
       </w:r>
-      <w:r>
-        <w:rPr>
-          <w:lang w:val="nl-BE"/>
-        </w:rPr>
-        <w:br/>
-      </w:r>
     </w:p>
     <w:p>
       <w:pPr>
@@ -4346,7 +4221,7 @@
         <w:rPr>
           <w:sz w:val="20"/>
           <w:szCs w:val="20"/>
-          <w:lang w:val="en-US"/>
+          <w:lang w:val="nl-BE"/>
         </w:rPr>
       </w:pPr>
       <w:r>
@@ -4373,59 +4248,13 @@
         </w:rPr>
         <w:t xml:space="preserve">. </w:t>
       </w:r>
-      <w:proofErr w:type="spellStart"/>
-      <w:r>
-        <w:rPr>
-          <w:sz w:val="20"/>
-          <w:szCs w:val="20"/>
-          <w:lang w:val="en-US"/>
-        </w:rPr>
-        <w:t>Tijdens</w:t>
-      </w:r>
-      <w:proofErr w:type="spellEnd"/>
-      <w:r>
-        <w:rPr>
-          <w:sz w:val="20"/>
-          <w:szCs w:val="20"/>
-          <w:lang w:val="en-US"/>
-        </w:rPr>
-        <w:t xml:space="preserve"> </w:t>
-      </w:r>
-      <w:proofErr w:type="spellStart"/>
-      <w:r>
-        <w:rPr>
-          <w:sz w:val="20"/>
-          <w:szCs w:val="20"/>
-          <w:lang w:val="en-US"/>
-        </w:rPr>
-        <w:t>deze</w:t>
-      </w:r>
-      <w:proofErr w:type="spellEnd"/>
-      <w:r>
-        <w:rPr>
-          <w:sz w:val="20"/>
-          <w:szCs w:val="20"/>
-          <w:lang w:val="en-US"/>
-        </w:rPr>
-        <w:t xml:space="preserve"> </w:t>
-      </w:r>
-      <w:proofErr w:type="spellStart"/>
-      <w:r>
-        <w:rPr>
-          <w:sz w:val="20"/>
-          <w:szCs w:val="20"/>
-          <w:lang w:val="en-US"/>
-        </w:rPr>
-        <w:t>bezoeken</w:t>
-      </w:r>
-      <w:proofErr w:type="spellEnd"/>
-      <w:r>
-        <w:rPr>
-          <w:sz w:val="20"/>
-          <w:szCs w:val="20"/>
-          <w:lang w:val="en-US"/>
-        </w:rPr>
-        <w:t>:</w:t>
+      <w:r>
+        <w:rPr>
+          <w:sz w:val="20"/>
+          <w:szCs w:val="20"/>
+          <w:lang w:val="nl-BE"/>
+        </w:rPr>
+        <w:t>Tijdens deze bezoeken:</w:t>
       </w:r>
     </w:p>
     <w:p>
@@ -4836,7 +4665,7 @@
     </w:p>
     <w:p>
       <w:pPr>
-        <w:spacing w:beforeAutospacing="1" w:afterAutospacing="1"/>
+        <w:spacing w:before="281" w:after="281"/>
         <w:jc w:val="both"/>
         <w:rPr>
           <w:b/>
@@ -4846,33 +4675,7 @@
           <w:lang w:val="nl-BE"/>
         </w:rPr>
       </w:pPr>
-    </w:p>
-    <w:p>
-      <w:pPr>
-        <w:spacing w:before="100" w:beforeAutospacing="1" w:after="100" w:afterAutospacing="1"/>
-        <w:jc w:val="both"/>
-        <w:rPr>
-          <w:sz w:val="20"/>
-          <w:szCs w:val="20"/>
-          <w:lang w:val="nl-BE" w:eastAsia="en-US"/>
-        </w:rPr>
-      </w:pPr>
-    </w:p>
-    <w:p>
-      <w:pPr>
-        <w:spacing w:before="100" w:beforeAutospacing="1" w:after="100" w:afterAutospacing="1"/>
-        <w:jc w:val="both"/>
-        <w:rPr>
-          <w:sz w:val="20"/>
-          <w:szCs w:val="20"/>
-          <w:lang w:val="nl-NL" w:eastAsia="en-US"/>
-        </w:rPr>
-      </w:pPr>
-    </w:p>
-    <w:p>
-      <w:pPr>
-        <w:spacing w:before="281" w:after="281"/>
-        <w:jc w:val="both"/>
+      <w:r>
         <w:rPr>
           <w:b/>
           <w:bCs/>
@@ -4880,15 +4683,6 @@
           <w:szCs w:val="20"/>
           <w:lang w:val="nl-BE"/>
         </w:rPr>
-      </w:pPr>
-      <w:r>
-        <w:rPr>
-          <w:b/>
-          <w:bCs/>
-          <w:sz w:val="20"/>
-          <w:szCs w:val="20"/>
-          <w:lang w:val="nl-BE"/>
-        </w:rPr>
         <w:t>Tijdens de volledige studie</w:t>
       </w:r>
     </w:p>
@@ -5001,6 +4795,81 @@
       </w:pPr>
       <w:r>
         <w:rPr>
+          <w:noProof/>
+          <w:color w:val="24303B"/>
+          <w:sz w:val="20"/>
+          <w:szCs w:val="20"/>
+        </w:rPr>
+        <w:drawing>
+          <wp:anchor distT="0" distB="0" distL="114300" distR="114300" simplePos="0" relativeHeight="251668992" behindDoc="0" locked="0" layoutInCell="1" allowOverlap="1" wp14:anchorId="6393DF4A" wp14:editId="7F7BE668">
+            <wp:simplePos x="0" y="0"/>
+            <wp:positionH relativeFrom="column">
+              <wp:posOffset>4220845</wp:posOffset>
+            </wp:positionH>
+            <wp:positionV relativeFrom="paragraph">
+              <wp:posOffset>295788</wp:posOffset>
+            </wp:positionV>
+            <wp:extent cx="785006" cy="102519"/>
+            <wp:effectExtent l="0" t="0" r="0" b="0"/>
+            <wp:wrapNone/>
+            <wp:docPr id="1461414524" name="Picture 1"/>
+            <wp:cNvGraphicFramePr>
+              <a:graphicFrameLocks xmlns:a="http://schemas.openxmlformats.org/drawingml/2006/main" noChangeAspect="1"/>
+            </wp:cNvGraphicFramePr>
+            <a:graphic xmlns:a="http://schemas.openxmlformats.org/drawingml/2006/main">
+              <a:graphicData uri="http://schemas.openxmlformats.org/drawingml/2006/picture">
+                <pic:pic xmlns:pic="http://schemas.openxmlformats.org/drawingml/2006/picture">
+                  <pic:nvPicPr>
+                    <pic:cNvPr id="0" name="Picture 2"/>
+                    <pic:cNvPicPr>
+                      <a:picLocks noChangeAspect="1" noChangeArrowheads="1"/>
+                    </pic:cNvPicPr>
+                  </pic:nvPicPr>
+                  <pic:blipFill rotWithShape="1">
+                    <a:blip r:embed="rId25" cstate="print">
+                      <a:extLst>
+                        <a:ext uri="{28A0092B-C50C-407E-A947-70E740481C1C}">
+                          <a14:useLocalDpi xmlns:a14="http://schemas.microsoft.com/office/drawing/2010/main" val="0"/>
+                        </a:ext>
+                      </a:extLst>
+                    </a:blip>
+                    <a:srcRect l="26556" t="-98" r="59797" b="97971"/>
+                    <a:stretch>
+                      <a:fillRect/>
+                    </a:stretch>
+                  </pic:blipFill>
+                  <pic:spPr bwMode="auto">
+                    <a:xfrm>
+                      <a:off x="0" y="0"/>
+                      <a:ext cx="784860" cy="102235"/>
+                    </a:xfrm>
+                    <a:prstGeom prst="rect">
+                      <a:avLst/>
+                    </a:prstGeom>
+                    <a:noFill/>
+                    <a:ln>
+                      <a:noFill/>
+                    </a:ln>
+                    <a:extLst>
+                      <a:ext uri="{53640926-AAD7-44D8-BBD7-CCE9431645EC}">
+                        <a14:shadowObscured xmlns:a14="http://schemas.microsoft.com/office/drawing/2010/main"/>
+                      </a:ext>
+                    </a:extLst>
+                  </pic:spPr>
+                </pic:pic>
+              </a:graphicData>
+            </a:graphic>
+            <wp14:sizeRelH relativeFrom="margin">
+              <wp14:pctWidth>0</wp14:pctWidth>
+            </wp14:sizeRelH>
+            <wp14:sizeRelV relativeFrom="margin">
+              <wp14:pctHeight>0</wp14:pctHeight>
+            </wp14:sizeRelV>
+          </wp:anchor>
+        </w:drawing>
+      </w:r>
+      <w:r>
+        <w:rPr>
           <w:sz w:val="20"/>
           <w:szCs w:val="20"/>
           <w:lang w:val="nl-BE"/>
@@ -5010,37 +4879,165 @@
     </w:p>
     <w:p>
       <w:pPr>
-        <w:spacing w:beforeAutospacing="1" w:afterAutospacing="1"/>
-        <w:jc w:val="both"/>
-        <w:rPr>
-          <w:sz w:val="20"/>
-          <w:szCs w:val="20"/>
-          <w:lang w:val="nl-BE" w:eastAsia="en-US"/>
-        </w:rPr>
-      </w:pPr>
-    </w:p>
-    <w:p>
-      <w:pPr>
         <w:rPr>
           <w:noProof/>
           <w:sz w:val="20"/>
           <w:szCs w:val="20"/>
-          <w:lang/>
         </w:rPr>
       </w:pPr>
       <w:r>
         <w:rPr>
           <w:noProof/>
-          <w:color w:val="24303B"/>
-          <w:sz w:val="20"/>
-          <w:szCs w:val="20"/>
-          <w:lang/>
+          <w:sz w:val="20"/>
+          <w:szCs w:val="20"/>
+        </w:rPr>
+        <mc:AlternateContent>
+          <mc:Choice Requires="wps">
+            <w:drawing>
+              <wp:anchor distT="45720" distB="45720" distL="114300" distR="114300" simplePos="0" relativeHeight="251674112" behindDoc="0" locked="0" layoutInCell="1" allowOverlap="1" wp14:anchorId="250FA6B3" wp14:editId="77DB0902">
+                <wp:simplePos x="0" y="0"/>
+                <wp:positionH relativeFrom="margin">
+                  <wp:posOffset>2605405</wp:posOffset>
+                </wp:positionH>
+                <wp:positionV relativeFrom="paragraph">
+                  <wp:posOffset>114935</wp:posOffset>
+                </wp:positionV>
+                <wp:extent cx="492369" cy="158115"/>
+                <wp:effectExtent l="0" t="0" r="22225" b="13335"/>
+                <wp:wrapNone/>
+                <wp:docPr id="217" name="Tekstvak 2"/>
+                <wp:cNvGraphicFramePr>
+                  <a:graphicFrameLocks xmlns:a="http://schemas.openxmlformats.org/drawingml/2006/main"/>
+                </wp:cNvGraphicFramePr>
+                <a:graphic xmlns:a="http://schemas.openxmlformats.org/drawingml/2006/main">
+                  <a:graphicData uri="http://schemas.microsoft.com/office/word/2010/wordprocessingShape">
+                    <wps:wsp>
+                      <wps:cNvSpPr txBox="1">
+                        <a:spLocks noChangeArrowheads="1"/>
+                      </wps:cNvSpPr>
+                      <wps:spPr bwMode="auto">
+                        <a:xfrm>
+                          <a:off x="0" y="0"/>
+                          <a:ext cx="492369" cy="158115"/>
+                        </a:xfrm>
+                        <a:prstGeom prst="rect">
+                          <a:avLst/>
+                        </a:prstGeom>
+                        <a:solidFill>
+                          <a:schemeClr val="bg1"/>
+                        </a:solidFill>
+                        <a:ln w="9525">
+                          <a:solidFill>
+                            <a:schemeClr val="bg1"/>
+                          </a:solidFill>
+                          <a:miter lim="800000"/>
+                          <a:headEnd/>
+                          <a:tailEnd/>
+                        </a:ln>
+                      </wps:spPr>
+                      <wps:txbx>
+                        <w:txbxContent>
+                          <w:p>
+                            <w:pPr>
+                              <w:rPr>
+                                <w:b/>
+                                <w:bCs/>
+                                <w:color w:val="262626" w:themeColor="text1" w:themeTint="D9"/>
+                                <w:sz w:val="10"/>
+                                <w:szCs w:val="10"/>
+                                <w:lang w:val="nl-BE"/>
+                              </w:rPr>
+                            </w:pPr>
+                            <w:proofErr w:type="spellStart"/>
+                            <w:r>
+                              <w:rPr>
+                                <w:b/>
+                                <w:bCs/>
+                                <w:color w:val="262626" w:themeColor="text1" w:themeTint="D9"/>
+                                <w:sz w:val="10"/>
+                                <w:szCs w:val="10"/>
+                              </w:rPr>
+                              <w:t>Educatie</w:t>
+                            </w:r>
+                            <w:proofErr w:type="spellEnd"/>
+                          </w:p>
+                        </w:txbxContent>
+                      </wps:txbx>
+                      <wps:bodyPr rot="0" vert="horz" wrap="square" lIns="91440" tIns="45720" rIns="91440" bIns="45720" anchor="t" anchorCtr="0">
+                        <a:noAutofit/>
+                      </wps:bodyPr>
+                    </wps:wsp>
+                  </a:graphicData>
+                </a:graphic>
+                <wp14:sizeRelH relativeFrom="margin">
+                  <wp14:pctWidth>0</wp14:pctWidth>
+                </wp14:sizeRelH>
+                <wp14:sizeRelV relativeFrom="margin">
+                  <wp14:pctHeight>0</wp14:pctHeight>
+                </wp14:sizeRelV>
+              </wp:anchor>
+            </w:drawing>
+          </mc:Choice>
+          <mc:Fallback>
+            <w:pict>
+              <v:shapetype w14:anchorId="250FA6B3" id="_x0000_t202" coordsize="21600,21600" o:spt="202" path="m,l,21600r21600,l21600,xe">
+                <v:stroke joinstyle="miter"/>
+                <v:path gradientshapeok="t" o:connecttype="rect"/>
+              </v:shapetype>
+              <v:shape id="Tekstvak 2" o:spid="_x0000_s1026" type="#_x0000_t202" style="position:absolute;margin-left:205.15pt;margin-top:9.05pt;width:38.75pt;height:12.45pt;z-index:251674112;visibility:visible;mso-wrap-style:square;mso-width-percent:0;mso-height-percent:0;mso-wrap-distance-left:9pt;mso-wrap-distance-top:3.6pt;mso-wrap-distance-right:9pt;mso-wrap-distance-bottom:3.6pt;mso-position-horizontal:absolute;mso-position-horizontal-relative:margin;mso-position-vertical:absolute;mso-position-vertical-relative:text;mso-width-percent:0;mso-height-percent:0;mso-width-relative:margin;mso-height-relative:margin;v-text-anchor:top" o:gfxdata="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" fillcolor="white [3212]" strokecolor="white [3212]">
+                <v:textbox>
+                  <w:txbxContent>
+                    <w:p>
+                      <w:pPr>
+                        <w:rPr>
+                          <w:b/>
+                          <w:bCs/>
+                          <w:color w:val="262626" w:themeColor="text1" w:themeTint="D9"/>
+                          <w:sz w:val="10"/>
+                          <w:szCs w:val="10"/>
+                          <w:lang w:val="nl-BE"/>
+                        </w:rPr>
+                      </w:pPr>
+                      <w:proofErr w:type="spellStart"/>
+                      <w:r>
+                        <w:rPr>
+                          <w:b/>
+                          <w:bCs/>
+                          <w:color w:val="262626" w:themeColor="text1" w:themeTint="D9"/>
+                          <w:sz w:val="10"/>
+                          <w:szCs w:val="10"/>
+                        </w:rPr>
+                        <w:t>Educatie</w:t>
+                      </w:r>
+                      <w:proofErr w:type="spellEnd"/>
+                    </w:p>
+                  </w:txbxContent>
+                </v:textbox>
+                <w10:wrap anchorx="margin"/>
+              </v:shape>
+            </w:pict>
+          </mc:Fallback>
+        </mc:AlternateContent>
+      </w:r>
+      <w:r>
+        <w:rPr>
+          <w:noProof/>
+          <w:sz w:val="20"/>
+          <w:szCs w:val="20"/>
         </w:rPr>
         <w:drawing>
-          <wp:inline distT="0" distB="0" distL="0" distR="0" wp14:anchorId="0E95F5D5" wp14:editId="24C49F43">
-            <wp:extent cx="5886026" cy="4815840"/>
-            <wp:effectExtent l="0" t="0" r="635" b="3810"/>
-            <wp:docPr id="1737493242" name="Picture 1"/>
+          <wp:anchor distT="0" distB="0" distL="114300" distR="114300" simplePos="0" relativeHeight="251675136" behindDoc="0" locked="0" layoutInCell="1" allowOverlap="1" wp14:anchorId="4C09926E" wp14:editId="2D0634CC">
+            <wp:simplePos x="0" y="0"/>
+            <wp:positionH relativeFrom="column">
+              <wp:posOffset>2987516</wp:posOffset>
+            </wp:positionH>
+            <wp:positionV relativeFrom="paragraph">
+              <wp:posOffset>119221</wp:posOffset>
+            </wp:positionV>
+            <wp:extent cx="336589" cy="176852"/>
+            <wp:effectExtent l="0" t="0" r="6350" b="0"/>
+            <wp:wrapNone/>
+            <wp:docPr id="440261788" name="Afbeelding 3"/>
             <wp:cNvGraphicFramePr>
               <a:graphicFrameLocks xmlns:a="http://schemas.openxmlformats.org/drawingml/2006/main" noChangeAspect="1"/>
             </wp:cNvGraphicFramePr>
@@ -5054,7 +5051,7 @@
                     </pic:cNvPicPr>
                   </pic:nvPicPr>
                   <pic:blipFill>
-                    <a:blip r:embed="rId23" cstate="print">
+                    <a:blip r:embed="rId26">
                       <a:extLst>
                         <a:ext uri="{28A0092B-C50C-407E-A947-70E740481C1C}">
                           <a14:useLocalDpi xmlns:a14="http://schemas.microsoft.com/office/drawing/2010/main" val="0"/>
@@ -5069,7 +5066,214 @@
                   <pic:spPr bwMode="auto">
                     <a:xfrm>
                       <a:off x="0" y="0"/>
-                      <a:ext cx="5907558" cy="4833457"/>
+                      <a:ext cx="336589" cy="176852"/>
+                    </a:xfrm>
+                    <a:prstGeom prst="rect">
+                      <a:avLst/>
+                    </a:prstGeom>
+                    <a:noFill/>
+                  </pic:spPr>
+                </pic:pic>
+              </a:graphicData>
+            </a:graphic>
+            <wp14:sizeRelH relativeFrom="margin">
+              <wp14:pctWidth>0</wp14:pctWidth>
+            </wp14:sizeRelH>
+            <wp14:sizeRelV relativeFrom="margin">
+              <wp14:pctHeight>0</wp14:pctHeight>
+            </wp14:sizeRelV>
+          </wp:anchor>
+        </w:drawing>
+      </w:r>
+      <w:r>
+        <w:rPr>
+          <w:noProof/>
+          <w:color w:val="24303B"/>
+          <w:sz w:val="20"/>
+          <w:szCs w:val="20"/>
+        </w:rPr>
+        <w:drawing>
+          <wp:anchor distT="0" distB="0" distL="114300" distR="114300" simplePos="0" relativeHeight="251671040" behindDoc="0" locked="0" layoutInCell="1" allowOverlap="1" wp14:anchorId="0E95F5D5" wp14:editId="0C1F77D0">
+            <wp:simplePos x="0" y="0"/>
+            <wp:positionH relativeFrom="column">
+              <wp:posOffset>1582630</wp:posOffset>
+            </wp:positionH>
+            <wp:positionV relativeFrom="paragraph">
+              <wp:posOffset>16404</wp:posOffset>
+            </wp:positionV>
+            <wp:extent cx="666750" cy="88900"/>
+            <wp:effectExtent l="0" t="0" r="0" b="6350"/>
+            <wp:wrapNone/>
+            <wp:docPr id="1737493242" name="Picture 1"/>
+            <wp:cNvGraphicFramePr>
+              <a:graphicFrameLocks xmlns:a="http://schemas.openxmlformats.org/drawingml/2006/main" noChangeAspect="1"/>
+            </wp:cNvGraphicFramePr>
+            <a:graphic xmlns:a="http://schemas.openxmlformats.org/drawingml/2006/main">
+              <a:graphicData uri="http://schemas.openxmlformats.org/drawingml/2006/picture">
+                <pic:pic xmlns:pic="http://schemas.openxmlformats.org/drawingml/2006/picture">
+                  <pic:nvPicPr>
+                    <pic:cNvPr id="0" name="Picture 2"/>
+                    <pic:cNvPicPr>
+                      <a:picLocks noChangeAspect="1" noChangeArrowheads="1"/>
+                    </pic:cNvPicPr>
+                  </pic:nvPicPr>
+                  <pic:blipFill rotWithShape="1">
+                    <a:blip r:embed="rId25" cstate="print">
+                      <a:extLst>
+                        <a:ext uri="{28A0092B-C50C-407E-A947-70E740481C1C}">
+                          <a14:useLocalDpi xmlns:a14="http://schemas.microsoft.com/office/drawing/2010/main" val="0"/>
+                        </a:ext>
+                      </a:extLst>
+                    </a:blip>
+                    <a:srcRect l="73363" t="397" r="15309" b="97757"/>
+                    <a:stretch>
+                      <a:fillRect/>
+                    </a:stretch>
+                  </pic:blipFill>
+                  <pic:spPr bwMode="auto">
+                    <a:xfrm>
+                      <a:off x="0" y="0"/>
+                      <a:ext cx="666750" cy="88900"/>
+                    </a:xfrm>
+                    <a:prstGeom prst="rect">
+                      <a:avLst/>
+                    </a:prstGeom>
+                    <a:noFill/>
+                    <a:ln>
+                      <a:noFill/>
+                    </a:ln>
+                    <a:extLst>
+                      <a:ext uri="{53640926-AAD7-44D8-BBD7-CCE9431645EC}">
+                        <a14:shadowObscured xmlns:a14="http://schemas.microsoft.com/office/drawing/2010/main"/>
+                      </a:ext>
+                    </a:extLst>
+                  </pic:spPr>
+                </pic:pic>
+              </a:graphicData>
+            </a:graphic>
+          </wp:anchor>
+        </w:drawing>
+      </w:r>
+      <w:r>
+        <w:rPr>
+          <w:noProof/>
+          <w:color w:val="24303B"/>
+          <w:sz w:val="20"/>
+          <w:szCs w:val="20"/>
+        </w:rPr>
+        <mc:AlternateContent>
+          <mc:Choice Requires="wps">
+            <w:drawing>
+              <wp:anchor distT="0" distB="0" distL="114300" distR="114300" simplePos="0" relativeHeight="251670016" behindDoc="0" locked="0" layoutInCell="1" allowOverlap="1" wp14:anchorId="3EAC40F3" wp14:editId="4C5F235B">
+                <wp:simplePos x="0" y="0"/>
+                <wp:positionH relativeFrom="column">
+                  <wp:posOffset>1568556</wp:posOffset>
+                </wp:positionH>
+                <wp:positionV relativeFrom="paragraph">
+                  <wp:posOffset>28017</wp:posOffset>
+                </wp:positionV>
+                <wp:extent cx="739977" cy="63427"/>
+                <wp:effectExtent l="0" t="0" r="22225" b="13335"/>
+                <wp:wrapNone/>
+                <wp:docPr id="816585996" name="Rechthoek 1"/>
+                <wp:cNvGraphicFramePr/>
+                <a:graphic xmlns:a="http://schemas.openxmlformats.org/drawingml/2006/main">
+                  <a:graphicData uri="http://schemas.microsoft.com/office/word/2010/wordprocessingShape">
+                    <wps:wsp>
+                      <wps:cNvSpPr/>
+                      <wps:spPr>
+                        <a:xfrm>
+                          <a:off x="0" y="0"/>
+                          <a:ext cx="739977" cy="63427"/>
+                        </a:xfrm>
+                        <a:prstGeom prst="rect">
+                          <a:avLst/>
+                        </a:prstGeom>
+                        <a:solidFill>
+                          <a:schemeClr val="bg1"/>
+                        </a:solidFill>
+                        <a:ln>
+                          <a:solidFill>
+                            <a:schemeClr val="bg1"/>
+                          </a:solidFill>
+                        </a:ln>
+                      </wps:spPr>
+                      <wps:style>
+                        <a:lnRef idx="2">
+                          <a:schemeClr val="accent1">
+                            <a:shade val="15000"/>
+                          </a:schemeClr>
+                        </a:lnRef>
+                        <a:fillRef idx="1">
+                          <a:schemeClr val="accent1"/>
+                        </a:fillRef>
+                        <a:effectRef idx="0">
+                          <a:schemeClr val="accent1"/>
+                        </a:effectRef>
+                        <a:fontRef idx="minor">
+                          <a:schemeClr val="lt1"/>
+                        </a:fontRef>
+                      </wps:style>
+                      <wps:bodyPr rot="0" spcFirstLastPara="0" vertOverflow="overflow" horzOverflow="overflow" vert="horz" wrap="square" lIns="91440" tIns="45720" rIns="91440" bIns="45720" numCol="1" spcCol="0" rtlCol="0" fromWordArt="0" anchor="ctr" anchorCtr="0" forceAA="0" compatLnSpc="1">
+                        <a:prstTxWarp prst="textNoShape">
+                          <a:avLst/>
+                        </a:prstTxWarp>
+                        <a:noAutofit/>
+                      </wps:bodyPr>
+                    </wps:wsp>
+                  </a:graphicData>
+                </a:graphic>
+              </wp:anchor>
+            </w:drawing>
+          </mc:Choice>
+          <mc:Fallback>
+            <w:pict>
+              <v:rect w14:anchorId="11656EF9" id="Rechthoek 1" o:spid="_x0000_s1026" style="position:absolute;margin-left:123.5pt;margin-top:2.2pt;width:58.25pt;height:5pt;z-index:251670016;visibility:visible;mso-wrap-style:square;mso-wrap-distance-left:9pt;mso-wrap-distance-top:0;mso-wrap-distance-right:9pt;mso-wrap-distance-bottom:0;mso-position-horizontal:absolute;mso-position-horizontal-relative:text;mso-position-vertical:absolute;mso-position-vertical-relative:text;v-text-anchor:middle" o:gfxdata="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" fillcolor="white [3212]" strokecolor="white [3212]" strokeweight="1.5pt"/>
+            </w:pict>
+          </mc:Fallback>
+        </mc:AlternateContent>
+      </w:r>
+      <w:r>
+        <w:rPr>
+          <w:noProof/>
+          <w:color w:val="24303B"/>
+          <w:sz w:val="20"/>
+          <w:szCs w:val="20"/>
+        </w:rPr>
+        <w:drawing>
+          <wp:inline distT="0" distB="0" distL="0" distR="0" wp14:anchorId="7CC45F9A" wp14:editId="663DA815">
+            <wp:extent cx="5760720" cy="4712970"/>
+            <wp:effectExtent l="0" t="0" r="0" b="0"/>
+            <wp:docPr id="192679241" name="Picture 1"/>
+            <wp:cNvGraphicFramePr>
+              <a:graphicFrameLocks xmlns:a="http://schemas.openxmlformats.org/drawingml/2006/main" noChangeAspect="1"/>
+            </wp:cNvGraphicFramePr>
+            <a:graphic xmlns:a="http://schemas.openxmlformats.org/drawingml/2006/main">
+              <a:graphicData uri="http://schemas.openxmlformats.org/drawingml/2006/picture">
+                <pic:pic xmlns:pic="http://schemas.openxmlformats.org/drawingml/2006/picture">
+                  <pic:nvPicPr>
+                    <pic:cNvPr id="0" name="Picture 2"/>
+                    <pic:cNvPicPr>
+                      <a:picLocks noChangeAspect="1" noChangeArrowheads="1"/>
+                    </pic:cNvPicPr>
+                  </pic:nvPicPr>
+                  <pic:blipFill>
+                    <a:blip r:embed="rId25" cstate="print">
+                      <a:extLst>
+                        <a:ext uri="{28A0092B-C50C-407E-A947-70E740481C1C}">
+                          <a14:useLocalDpi xmlns:a14="http://schemas.microsoft.com/office/drawing/2010/main" val="0"/>
+                        </a:ext>
+                      </a:extLst>
+                    </a:blip>
+                    <a:srcRect/>
+                    <a:stretch>
+                      <a:fillRect/>
+                    </a:stretch>
+                  </pic:blipFill>
+                  <pic:spPr bwMode="auto">
+                    <a:xfrm>
+                      <a:off x="0" y="0"/>
+                      <a:ext cx="5760720" cy="4712970"/>
                     </a:xfrm>
                     <a:prstGeom prst="rect">
                       <a:avLst/>
@@ -5089,7 +5293,6 @@
           <w:noProof/>
           <w:sz w:val="20"/>
           <w:szCs w:val="20"/>
-          <w:lang/>
         </w:rPr>
       </w:pPr>
     </w:p>
@@ -5108,7 +5311,7 @@
           <w:color w:val="24303B"/>
           <w:sz w:val="18"/>
           <w:szCs w:val="18"/>
-          <w:lang/>
+          <w:lang w:val="nl-BE"/>
         </w:rPr>
         <w:t>Figuur 5.</w:t>
       </w:r>
@@ -5117,7 +5320,7 @@
           <w:color w:val="24303B"/>
           <w:sz w:val="18"/>
           <w:szCs w:val="18"/>
-          <w:lang/>
+          <w:lang w:val="nl-BE"/>
         </w:rPr>
         <w:t xml:space="preserve"> </w:t>
       </w:r>
@@ -5136,7 +5339,7 @@
         <w:rPr>
           <w:sz w:val="18"/>
           <w:szCs w:val="18"/>
-          <w:lang/>
+          <w:lang w:val="nl-BE"/>
         </w:rPr>
       </w:pPr>
     </w:p>
@@ -5263,7 +5466,6 @@
           <w:szCs w:val="20"/>
           <w:lang w:val="nl-BE"/>
         </w:rPr>
-        <w:lastRenderedPageBreak/>
         <w:t>Uw deelname aan deze studie zal beëindigd worden als de onderzoeker meent dat dit in uw belang is. U kan ook voortijdig uit de studie teruggetrokken worden door de onderzoeker als u de in deze informatiebrief beschreven procedures niet goed opvolgt of u de beschreven items niet respecteert.</w:t>
       </w:r>
     </w:p>
@@ -5289,6 +5491,7 @@
           <w:szCs w:val="20"/>
           <w:lang w:val="nl-BE"/>
         </w:rPr>
+        <w:lastRenderedPageBreak/>
         <w:t>Indien</w:t>
       </w:r>
       <w:proofErr w:type="gramEnd"/>
@@ -5502,7 +5705,29 @@
           <w:szCs w:val="20"/>
           <w:lang w:val="nl-BE"/>
         </w:rPr>
-        <w:t xml:space="preserve"> de rechten van de patiënt en de betreffende de bescherming van natuurlijke personen in verband met de verwerking van persoonsgegevens en </w:t>
+        <w:t xml:space="preserve"> de rechten van de patiënt en </w:t>
+      </w:r>
+      <w:proofErr w:type="gramStart"/>
+      <w:r>
+        <w:rPr>
+          <w:bCs/>
+          <w:color w:val="000000"/>
+          <w:sz w:val="20"/>
+          <w:szCs w:val="20"/>
+          <w:lang w:val="nl-BE"/>
+        </w:rPr>
+        <w:t>betreffende</w:t>
+      </w:r>
+      <w:proofErr w:type="gramEnd"/>
+      <w:r>
+        <w:rPr>
+          <w:bCs/>
+          <w:color w:val="000000"/>
+          <w:sz w:val="20"/>
+          <w:szCs w:val="20"/>
+          <w:lang w:val="nl-BE"/>
+        </w:rPr>
+        <w:t xml:space="preserve"> de bescherming van natuurlijke personen in verband met de verwerking van persoonsgegevens en </w:t>
       </w:r>
       <w:proofErr w:type="gramStart"/>
       <w:r>
@@ -5962,7 +6187,6 @@
           <w:szCs w:val="20"/>
           <w:lang w:val="nl-BE"/>
         </w:rPr>
-        <w:lastRenderedPageBreak/>
         <w:t>Uw</w:t>
       </w:r>
       <w:r>
@@ -5998,6 +6222,7 @@
           <w:szCs w:val="20"/>
           <w:lang w:val="nl-BE"/>
         </w:rPr>
+        <w:lastRenderedPageBreak/>
         <w:t>Indien</w:t>
       </w:r>
       <w:proofErr w:type="gramEnd"/>
@@ -6017,6 +6242,7 @@
         <w:spacing w:before="120" w:after="60" w:line="259" w:lineRule="auto"/>
         <w:jc w:val="both"/>
         <w:rPr>
+          <w:color w:val="24303B"/>
           <w:sz w:val="20"/>
           <w:szCs w:val="20"/>
           <w:lang w:val="nl-BE"/>
@@ -6185,36 +6411,837 @@
         </w:rPr>
         <w:t xml:space="preserve">De contactgegevens van deze laatste zijn als volgt: </w:t>
       </w:r>
-      <w:r>
-        <w:rPr>
-          <w:color w:val="24303B"/>
-          <w:sz w:val="20"/>
-          <w:szCs w:val="20"/>
-          <w:highlight w:val="yellow"/>
-          <w:lang w:val="nl-BE"/>
-        </w:rPr>
-        <w:t xml:space="preserve">DPO - UZ Leuven, Herestraat 49, 3000 Leuven, e-mail </w:t>
-      </w:r>
-      <w:r>
-        <w:rPr>
-          <w:sz w:val="20"/>
-          <w:szCs w:val="20"/>
-          <w:highlight w:val="yellow"/>
-          <w:lang w:val="nl-BE"/>
-        </w:rPr>
-        <w:t>dpo@uzleuven.be</w:t>
-      </w:r>
-      <w:r>
-        <w:rPr>
-          <w:color w:val="24303B"/>
-          <w:sz w:val="20"/>
-          <w:szCs w:val="20"/>
-          <w:highlight w:val="yellow"/>
-          <w:lang w:val="nl-BE"/>
-        </w:rPr>
-        <w:t>.</w:t>
-      </w:r>
-    </w:p>
+    </w:p>
+    <w:tbl>
+      <w:tblPr>
+        <w:tblStyle w:val="Rastertabel1licht"/>
+        <w:tblW w:w="0" w:type="auto"/>
+        <w:tblLook w:val="04A0" w:firstRow="1" w:lastRow="0" w:firstColumn="1" w:lastColumn="0" w:noHBand="0" w:noVBand="1"/>
+      </w:tblPr>
+      <w:tblGrid>
+        <w:gridCol w:w="2139"/>
+        <w:gridCol w:w="2132"/>
+        <w:gridCol w:w="1348"/>
+        <w:gridCol w:w="3443"/>
+      </w:tblGrid>
+      <w:tr>
+        <w:trPr>
+          <w:cnfStyle w:val="100000000000" w:firstRow="1" w:lastRow="0" w:firstColumn="0" w:lastColumn="0" w:oddVBand="0" w:evenVBand="0" w:oddHBand="0" w:evenHBand="0" w:firstRowFirstColumn="0" w:firstRowLastColumn="0" w:lastRowFirstColumn="0" w:lastRowLastColumn="0"/>
+        </w:trPr>
+        <w:tc>
+          <w:tcPr>
+            <w:cnfStyle w:val="001000000000" w:firstRow="0" w:lastRow="0" w:firstColumn="1" w:lastColumn="0" w:oddVBand="0" w:evenVBand="0" w:oddHBand="0" w:evenHBand="0" w:firstRowFirstColumn="0" w:firstRowLastColumn="0" w:lastRowFirstColumn="0" w:lastRowLastColumn="0"/>
+            <w:tcW w:w="2069" w:type="dxa"/>
+            <w:hideMark/>
+          </w:tcPr>
+          <w:p>
+            <w:pPr>
+              <w:spacing w:before="120" w:after="60" w:line="259" w:lineRule="auto"/>
+              <w:jc w:val="both"/>
+              <w:rPr>
+                <w:sz w:val="20"/>
+                <w:szCs w:val="20"/>
+                <w:lang w:val="nl-BE"/>
+              </w:rPr>
+            </w:pPr>
+            <w:r>
+              <w:rPr>
+                <w:sz w:val="20"/>
+                <w:szCs w:val="20"/>
+                <w:lang w:val="nl-BE"/>
+              </w:rPr>
+              <w:t>Ziekenhuis</w:t>
+            </w:r>
+          </w:p>
+        </w:tc>
+        <w:tc>
+          <w:tcPr>
+            <w:tcW w:w="2132" w:type="dxa"/>
+            <w:hideMark/>
+          </w:tcPr>
+          <w:p>
+            <w:pPr>
+              <w:spacing w:before="120" w:after="60" w:line="259" w:lineRule="auto"/>
+              <w:jc w:val="both"/>
+              <w:cnfStyle w:val="100000000000" w:firstRow="1" w:lastRow="0" w:firstColumn="0" w:lastColumn="0" w:oddVBand="0" w:evenVBand="0" w:oddHBand="0" w:evenHBand="0" w:firstRowFirstColumn="0" w:firstRowLastColumn="0" w:lastRowFirstColumn="0" w:lastRowLastColumn="0"/>
+              <w:rPr>
+                <w:sz w:val="20"/>
+                <w:szCs w:val="20"/>
+                <w:lang w:val="nl-BE"/>
+              </w:rPr>
+            </w:pPr>
+            <w:r>
+              <w:rPr>
+                <w:sz w:val="20"/>
+                <w:szCs w:val="20"/>
+                <w:lang w:val="nl-BE"/>
+              </w:rPr>
+              <w:t>E-mail</w:t>
+            </w:r>
+          </w:p>
+        </w:tc>
+        <w:tc>
+          <w:tcPr>
+            <w:tcW w:w="0" w:type="auto"/>
+            <w:hideMark/>
+          </w:tcPr>
+          <w:p>
+            <w:pPr>
+              <w:spacing w:before="120" w:after="60" w:line="259" w:lineRule="auto"/>
+              <w:jc w:val="both"/>
+              <w:cnfStyle w:val="100000000000" w:firstRow="1" w:lastRow="0" w:firstColumn="0" w:lastColumn="0" w:oddVBand="0" w:evenVBand="0" w:oddHBand="0" w:evenHBand="0" w:firstRowFirstColumn="0" w:firstRowLastColumn="0" w:lastRowFirstColumn="0" w:lastRowLastColumn="0"/>
+              <w:rPr>
+                <w:sz w:val="20"/>
+                <w:szCs w:val="20"/>
+                <w:lang w:val="nl-BE"/>
+              </w:rPr>
+            </w:pPr>
+            <w:r>
+              <w:rPr>
+                <w:sz w:val="20"/>
+                <w:szCs w:val="20"/>
+                <w:lang w:val="nl-BE"/>
+              </w:rPr>
+              <w:t>Telefoon</w:t>
+            </w:r>
+          </w:p>
+        </w:tc>
+        <w:tc>
+          <w:tcPr>
+            <w:tcW w:w="0" w:type="auto"/>
+            <w:hideMark/>
+          </w:tcPr>
+          <w:p>
+            <w:pPr>
+              <w:spacing w:before="120" w:after="60" w:line="259" w:lineRule="auto"/>
+              <w:jc w:val="both"/>
+              <w:cnfStyle w:val="100000000000" w:firstRow="1" w:lastRow="0" w:firstColumn="0" w:lastColumn="0" w:oddVBand="0" w:evenVBand="0" w:oddHBand="0" w:evenHBand="0" w:firstRowFirstColumn="0" w:firstRowLastColumn="0" w:lastRowFirstColumn="0" w:lastRowLastColumn="0"/>
+              <w:rPr>
+                <w:sz w:val="20"/>
+                <w:szCs w:val="20"/>
+                <w:lang w:val="nl-BE"/>
+              </w:rPr>
+            </w:pPr>
+            <w:r>
+              <w:rPr>
+                <w:sz w:val="20"/>
+                <w:szCs w:val="20"/>
+                <w:lang w:val="nl-BE"/>
+              </w:rPr>
+              <w:t>Adres</w:t>
+            </w:r>
+          </w:p>
+        </w:tc>
+      </w:tr>
+      <w:tr>
+        <w:tc>
+          <w:tcPr>
+            <w:cnfStyle w:val="001000000000" w:firstRow="0" w:lastRow="0" w:firstColumn="1" w:lastColumn="0" w:oddVBand="0" w:evenVBand="0" w:oddHBand="0" w:evenHBand="0" w:firstRowFirstColumn="0" w:firstRowLastColumn="0" w:lastRowFirstColumn="0" w:lastRowLastColumn="0"/>
+            <w:tcW w:w="0" w:type="auto"/>
+            <w:hideMark/>
+          </w:tcPr>
+          <w:p>
+            <w:pPr>
+              <w:spacing w:before="120" w:after="60" w:line="259" w:lineRule="auto"/>
+              <w:jc w:val="both"/>
+              <w:rPr>
+                <w:b w:val="0"/>
+                <w:bCs w:val="0"/>
+                <w:sz w:val="20"/>
+                <w:szCs w:val="20"/>
+                <w:lang w:val="nl-BE"/>
+              </w:rPr>
+            </w:pPr>
+            <w:r>
+              <w:rPr>
+                <w:b w:val="0"/>
+                <w:bCs w:val="0"/>
+                <w:sz w:val="20"/>
+                <w:szCs w:val="20"/>
+                <w:lang w:val="nl-BE"/>
+              </w:rPr>
+              <w:t>UZ Leuven</w:t>
+            </w:r>
+          </w:p>
+        </w:tc>
+        <w:tc>
+          <w:tcPr>
+            <w:tcW w:w="0" w:type="auto"/>
+            <w:hideMark/>
+          </w:tcPr>
+          <w:p>
+            <w:pPr>
+              <w:spacing w:before="120" w:after="60" w:line="259" w:lineRule="auto"/>
+              <w:jc w:val="both"/>
+              <w:cnfStyle w:val="000000000000" w:firstRow="0" w:lastRow="0" w:firstColumn="0" w:lastColumn="0" w:oddVBand="0" w:evenVBand="0" w:oddHBand="0" w:evenHBand="0" w:firstRowFirstColumn="0" w:firstRowLastColumn="0" w:lastRowFirstColumn="0" w:lastRowLastColumn="0"/>
+              <w:rPr>
+                <w:sz w:val="20"/>
+                <w:szCs w:val="20"/>
+                <w:lang w:val="nl-BE"/>
+              </w:rPr>
+            </w:pPr>
+            <w:hyperlink r:id="rId27" w:history="1">
+              <w:r>
+                <w:rPr>
+                  <w:rStyle w:val="Hyperlink"/>
+                  <w:sz w:val="20"/>
+                  <w:szCs w:val="20"/>
+                  <w:lang w:val="nl-BE"/>
+                </w:rPr>
+                <w:t>gdpr@uzleuven.be</w:t>
+              </w:r>
+            </w:hyperlink>
+          </w:p>
+        </w:tc>
+        <w:tc>
+          <w:tcPr>
+            <w:tcW w:w="0" w:type="auto"/>
+            <w:hideMark/>
+          </w:tcPr>
+          <w:p>
+            <w:pPr>
+              <w:spacing w:before="120" w:after="60" w:line="259" w:lineRule="auto"/>
+              <w:jc w:val="both"/>
+              <w:cnfStyle w:val="000000000000" w:firstRow="0" w:lastRow="0" w:firstColumn="0" w:lastColumn="0" w:oddVBand="0" w:evenVBand="0" w:oddHBand="0" w:evenHBand="0" w:firstRowFirstColumn="0" w:firstRowLastColumn="0" w:lastRowFirstColumn="0" w:lastRowLastColumn="0"/>
+              <w:rPr>
+                <w:sz w:val="20"/>
+                <w:szCs w:val="20"/>
+                <w:lang w:val="nl-BE"/>
+              </w:rPr>
+            </w:pPr>
+            <w:r>
+              <w:rPr>
+                <w:sz w:val="20"/>
+                <w:szCs w:val="20"/>
+                <w:lang w:val="nl-BE"/>
+              </w:rPr>
+              <w:t>—</w:t>
+            </w:r>
+          </w:p>
+        </w:tc>
+        <w:tc>
+          <w:tcPr>
+            <w:tcW w:w="0" w:type="auto"/>
+            <w:hideMark/>
+          </w:tcPr>
+          <w:p>
+            <w:pPr>
+              <w:spacing w:before="120" w:after="60" w:line="259" w:lineRule="auto"/>
+              <w:jc w:val="both"/>
+              <w:cnfStyle w:val="000000000000" w:firstRow="0" w:lastRow="0" w:firstColumn="0" w:lastColumn="0" w:oddVBand="0" w:evenVBand="0" w:oddHBand="0" w:evenHBand="0" w:firstRowFirstColumn="0" w:firstRowLastColumn="0" w:lastRowFirstColumn="0" w:lastRowLastColumn="0"/>
+              <w:rPr>
+                <w:sz w:val="20"/>
+                <w:szCs w:val="20"/>
+                <w:lang w:val="nl-BE"/>
+              </w:rPr>
+            </w:pPr>
+            <w:r>
+              <w:rPr>
+                <w:sz w:val="20"/>
+                <w:szCs w:val="20"/>
+                <w:lang w:val="nl-BE"/>
+              </w:rPr>
+              <w:t>Herestraat 49, 3000 Leuven</w:t>
+            </w:r>
+          </w:p>
+        </w:tc>
+      </w:tr>
+      <w:tr>
+        <w:tc>
+          <w:tcPr>
+            <w:cnfStyle w:val="001000000000" w:firstRow="0" w:lastRow="0" w:firstColumn="1" w:lastColumn="0" w:oddVBand="0" w:evenVBand="0" w:oddHBand="0" w:evenHBand="0" w:firstRowFirstColumn="0" w:firstRowLastColumn="0" w:lastRowFirstColumn="0" w:lastRowLastColumn="0"/>
+            <w:tcW w:w="0" w:type="auto"/>
+            <w:hideMark/>
+          </w:tcPr>
+          <w:p>
+            <w:pPr>
+              <w:spacing w:before="120" w:after="60" w:line="259" w:lineRule="auto"/>
+              <w:jc w:val="both"/>
+              <w:rPr>
+                <w:b w:val="0"/>
+                <w:bCs w:val="0"/>
+                <w:sz w:val="20"/>
+                <w:szCs w:val="20"/>
+                <w:lang w:val="nl-BE"/>
+              </w:rPr>
+            </w:pPr>
+            <w:r>
+              <w:rPr>
+                <w:b w:val="0"/>
+                <w:bCs w:val="0"/>
+                <w:sz w:val="20"/>
+                <w:szCs w:val="20"/>
+                <w:lang w:val="nl-BE"/>
+              </w:rPr>
+              <w:t>UZA Antwerpen</w:t>
+            </w:r>
+          </w:p>
+        </w:tc>
+        <w:tc>
+          <w:tcPr>
+            <w:tcW w:w="0" w:type="auto"/>
+            <w:hideMark/>
+          </w:tcPr>
+          <w:p>
+            <w:pPr>
+              <w:spacing w:before="120" w:after="60" w:line="259" w:lineRule="auto"/>
+              <w:jc w:val="both"/>
+              <w:cnfStyle w:val="000000000000" w:firstRow="0" w:lastRow="0" w:firstColumn="0" w:lastColumn="0" w:oddVBand="0" w:evenVBand="0" w:oddHBand="0" w:evenHBand="0" w:firstRowFirstColumn="0" w:firstRowLastColumn="0" w:lastRowFirstColumn="0" w:lastRowLastColumn="0"/>
+              <w:rPr>
+                <w:sz w:val="20"/>
+                <w:szCs w:val="20"/>
+                <w:lang w:val="nl-BE"/>
+              </w:rPr>
+            </w:pPr>
+            <w:hyperlink r:id="rId28" w:history="1">
+              <w:r>
+                <w:rPr>
+                  <w:rStyle w:val="Hyperlink"/>
+                  <w:sz w:val="20"/>
+                  <w:szCs w:val="20"/>
+                  <w:lang w:val="nl-BE"/>
+                </w:rPr>
+                <w:t>dpo@uza.be</w:t>
+              </w:r>
+            </w:hyperlink>
+          </w:p>
+        </w:tc>
+        <w:tc>
+          <w:tcPr>
+            <w:tcW w:w="0" w:type="auto"/>
+            <w:hideMark/>
+          </w:tcPr>
+          <w:p>
+            <w:pPr>
+              <w:spacing w:before="120" w:after="60" w:line="259" w:lineRule="auto"/>
+              <w:jc w:val="both"/>
+              <w:cnfStyle w:val="000000000000" w:firstRow="0" w:lastRow="0" w:firstColumn="0" w:lastColumn="0" w:oddVBand="0" w:evenVBand="0" w:oddHBand="0" w:evenHBand="0" w:firstRowFirstColumn="0" w:firstRowLastColumn="0" w:lastRowFirstColumn="0" w:lastRowLastColumn="0"/>
+              <w:rPr>
+                <w:sz w:val="20"/>
+                <w:szCs w:val="20"/>
+                <w:lang w:val="nl-BE"/>
+              </w:rPr>
+            </w:pPr>
+            <w:r>
+              <w:rPr>
+                <w:sz w:val="20"/>
+                <w:szCs w:val="20"/>
+                <w:lang w:val="nl-BE"/>
+              </w:rPr>
+              <w:t>03 821 52 88</w:t>
+            </w:r>
+          </w:p>
+        </w:tc>
+        <w:tc>
+          <w:tcPr>
+            <w:tcW w:w="0" w:type="auto"/>
+            <w:hideMark/>
+          </w:tcPr>
+          <w:p>
+            <w:pPr>
+              <w:spacing w:before="120" w:after="60" w:line="259" w:lineRule="auto"/>
+              <w:jc w:val="both"/>
+              <w:cnfStyle w:val="000000000000" w:firstRow="0" w:lastRow="0" w:firstColumn="0" w:lastColumn="0" w:oddVBand="0" w:evenVBand="0" w:oddHBand="0" w:evenHBand="0" w:firstRowFirstColumn="0" w:firstRowLastColumn="0" w:lastRowFirstColumn="0" w:lastRowLastColumn="0"/>
+              <w:rPr>
+                <w:sz w:val="20"/>
+                <w:szCs w:val="20"/>
+                <w:lang w:val="nl-BE"/>
+              </w:rPr>
+            </w:pPr>
+            <w:r>
+              <w:rPr>
+                <w:sz w:val="20"/>
+                <w:szCs w:val="20"/>
+                <w:lang w:val="nl-BE"/>
+              </w:rPr>
+              <w:t>Drie Eikenstraat 655, 2650 Edegem</w:t>
+            </w:r>
+          </w:p>
+        </w:tc>
+      </w:tr>
+      <w:tr>
+        <w:tc>
+          <w:tcPr>
+            <w:cnfStyle w:val="001000000000" w:firstRow="0" w:lastRow="0" w:firstColumn="1" w:lastColumn="0" w:oddVBand="0" w:evenVBand="0" w:oddHBand="0" w:evenHBand="0" w:firstRowFirstColumn="0" w:firstRowLastColumn="0" w:lastRowFirstColumn="0" w:lastRowLastColumn="0"/>
+            <w:tcW w:w="0" w:type="auto"/>
+            <w:hideMark/>
+          </w:tcPr>
+          <w:p>
+            <w:pPr>
+              <w:spacing w:before="120" w:after="60" w:line="259" w:lineRule="auto"/>
+              <w:jc w:val="both"/>
+              <w:rPr>
+                <w:b w:val="0"/>
+                <w:bCs w:val="0"/>
+                <w:sz w:val="20"/>
+                <w:szCs w:val="20"/>
+                <w:lang w:val="nl-BE"/>
+              </w:rPr>
+            </w:pPr>
+            <w:r>
+              <w:rPr>
+                <w:b w:val="0"/>
+                <w:bCs w:val="0"/>
+                <w:sz w:val="20"/>
+                <w:szCs w:val="20"/>
+                <w:lang w:val="nl-BE"/>
+              </w:rPr>
+              <w:t>UZ Gent</w:t>
+            </w:r>
+          </w:p>
+        </w:tc>
+        <w:tc>
+          <w:tcPr>
+            <w:tcW w:w="0" w:type="auto"/>
+            <w:hideMark/>
+          </w:tcPr>
+          <w:p>
+            <w:pPr>
+              <w:spacing w:before="120" w:after="60" w:line="259" w:lineRule="auto"/>
+              <w:jc w:val="both"/>
+              <w:cnfStyle w:val="000000000000" w:firstRow="0" w:lastRow="0" w:firstColumn="0" w:lastColumn="0" w:oddVBand="0" w:evenVBand="0" w:oddHBand="0" w:evenHBand="0" w:firstRowFirstColumn="0" w:firstRowLastColumn="0" w:lastRowFirstColumn="0" w:lastRowLastColumn="0"/>
+              <w:rPr>
+                <w:sz w:val="20"/>
+                <w:szCs w:val="20"/>
+                <w:lang w:val="nl-BE"/>
+              </w:rPr>
+            </w:pPr>
+            <w:hyperlink r:id="rId29" w:history="1">
+              <w:r>
+                <w:rPr>
+                  <w:rStyle w:val="Hyperlink"/>
+                  <w:sz w:val="20"/>
+                  <w:szCs w:val="20"/>
+                  <w:lang w:val="nl-BE"/>
+                </w:rPr>
+                <w:t>dpo@uzgent.be</w:t>
+              </w:r>
+            </w:hyperlink>
+          </w:p>
+        </w:tc>
+        <w:tc>
+          <w:tcPr>
+            <w:tcW w:w="0" w:type="auto"/>
+            <w:hideMark/>
+          </w:tcPr>
+          <w:p>
+            <w:pPr>
+              <w:spacing w:before="120" w:after="60" w:line="259" w:lineRule="auto"/>
+              <w:jc w:val="both"/>
+              <w:cnfStyle w:val="000000000000" w:firstRow="0" w:lastRow="0" w:firstColumn="0" w:lastColumn="0" w:oddVBand="0" w:evenVBand="0" w:oddHBand="0" w:evenHBand="0" w:firstRowFirstColumn="0" w:firstRowLastColumn="0" w:lastRowFirstColumn="0" w:lastRowLastColumn="0"/>
+              <w:rPr>
+                <w:sz w:val="20"/>
+                <w:szCs w:val="20"/>
+                <w:lang w:val="nl-BE"/>
+              </w:rPr>
+            </w:pPr>
+            <w:r>
+              <w:rPr>
+                <w:sz w:val="20"/>
+                <w:szCs w:val="20"/>
+                <w:lang w:val="nl-BE"/>
+              </w:rPr>
+              <w:t>09 332 21 11</w:t>
+            </w:r>
+          </w:p>
+        </w:tc>
+        <w:tc>
+          <w:tcPr>
+            <w:tcW w:w="0" w:type="auto"/>
+            <w:hideMark/>
+          </w:tcPr>
+          <w:p>
+            <w:pPr>
+              <w:spacing w:before="120" w:after="60" w:line="259" w:lineRule="auto"/>
+              <w:jc w:val="both"/>
+              <w:cnfStyle w:val="000000000000" w:firstRow="0" w:lastRow="0" w:firstColumn="0" w:lastColumn="0" w:oddVBand="0" w:evenVBand="0" w:oddHBand="0" w:evenHBand="0" w:firstRowFirstColumn="0" w:firstRowLastColumn="0" w:lastRowFirstColumn="0" w:lastRowLastColumn="0"/>
+              <w:rPr>
+                <w:sz w:val="20"/>
+                <w:szCs w:val="20"/>
+                <w:lang w:val="nl-BE"/>
+              </w:rPr>
+            </w:pPr>
+            <w:r>
+              <w:rPr>
+                <w:sz w:val="20"/>
+                <w:szCs w:val="20"/>
+                <w:lang w:val="nl-BE"/>
+              </w:rPr>
+              <w:t>C. Heymanslaan 10, 9000 Gent</w:t>
+            </w:r>
+          </w:p>
+        </w:tc>
+      </w:tr>
+      <w:tr>
+        <w:tc>
+          <w:tcPr>
+            <w:cnfStyle w:val="001000000000" w:firstRow="0" w:lastRow="0" w:firstColumn="1" w:lastColumn="0" w:oddVBand="0" w:evenVBand="0" w:oddHBand="0" w:evenHBand="0" w:firstRowFirstColumn="0" w:firstRowLastColumn="0" w:lastRowFirstColumn="0" w:lastRowLastColumn="0"/>
+            <w:tcW w:w="0" w:type="auto"/>
+            <w:hideMark/>
+          </w:tcPr>
+          <w:p>
+            <w:pPr>
+              <w:spacing w:before="120" w:after="60" w:line="259" w:lineRule="auto"/>
+              <w:jc w:val="both"/>
+              <w:rPr>
+                <w:b w:val="0"/>
+                <w:bCs w:val="0"/>
+                <w:sz w:val="20"/>
+                <w:szCs w:val="20"/>
+                <w:lang w:val="nl-BE"/>
+              </w:rPr>
+            </w:pPr>
+            <w:r>
+              <w:rPr>
+                <w:b w:val="0"/>
+                <w:bCs w:val="0"/>
+                <w:sz w:val="20"/>
+                <w:szCs w:val="20"/>
+                <w:lang w:val="nl-BE"/>
+              </w:rPr>
+              <w:t>AZORG Aalst</w:t>
+            </w:r>
+          </w:p>
+        </w:tc>
+        <w:tc>
+          <w:tcPr>
+            <w:tcW w:w="0" w:type="auto"/>
+            <w:hideMark/>
+          </w:tcPr>
+          <w:p>
+            <w:pPr>
+              <w:spacing w:before="120" w:after="60" w:line="259" w:lineRule="auto"/>
+              <w:jc w:val="both"/>
+              <w:cnfStyle w:val="000000000000" w:firstRow="0" w:lastRow="0" w:firstColumn="0" w:lastColumn="0" w:oddVBand="0" w:evenVBand="0" w:oddHBand="0" w:evenHBand="0" w:firstRowFirstColumn="0" w:firstRowLastColumn="0" w:lastRowFirstColumn="0" w:lastRowLastColumn="0"/>
+              <w:rPr>
+                <w:sz w:val="20"/>
+                <w:szCs w:val="20"/>
+                <w:lang w:val="nl-BE"/>
+              </w:rPr>
+            </w:pPr>
+            <w:hyperlink r:id="rId30" w:history="1">
+              <w:r>
+                <w:rPr>
+                  <w:rStyle w:val="Hyperlink"/>
+                  <w:sz w:val="20"/>
+                  <w:szCs w:val="20"/>
+                  <w:lang w:val="nl-BE"/>
+                </w:rPr>
+                <w:t>dpo@azorg.be</w:t>
+              </w:r>
+            </w:hyperlink>
+          </w:p>
+        </w:tc>
+        <w:tc>
+          <w:tcPr>
+            <w:tcW w:w="0" w:type="auto"/>
+            <w:hideMark/>
+          </w:tcPr>
+          <w:p>
+            <w:pPr>
+              <w:spacing w:before="120" w:after="60" w:line="259" w:lineRule="auto"/>
+              <w:jc w:val="both"/>
+              <w:cnfStyle w:val="000000000000" w:firstRow="0" w:lastRow="0" w:firstColumn="0" w:lastColumn="0" w:oddVBand="0" w:evenVBand="0" w:oddHBand="0" w:evenHBand="0" w:firstRowFirstColumn="0" w:firstRowLastColumn="0" w:lastRowFirstColumn="0" w:lastRowLastColumn="0"/>
+              <w:rPr>
+                <w:sz w:val="20"/>
+                <w:szCs w:val="20"/>
+                <w:lang w:val="nl-BE"/>
+              </w:rPr>
+            </w:pPr>
+            <w:r>
+              <w:rPr>
+                <w:sz w:val="20"/>
+                <w:szCs w:val="20"/>
+                <w:lang w:val="nl-BE"/>
+              </w:rPr>
+              <w:t>—</w:t>
+            </w:r>
+          </w:p>
+        </w:tc>
+        <w:tc>
+          <w:tcPr>
+            <w:tcW w:w="0" w:type="auto"/>
+            <w:hideMark/>
+          </w:tcPr>
+          <w:p>
+            <w:pPr>
+              <w:spacing w:before="120" w:after="60" w:line="259" w:lineRule="auto"/>
+              <w:jc w:val="both"/>
+              <w:cnfStyle w:val="000000000000" w:firstRow="0" w:lastRow="0" w:firstColumn="0" w:lastColumn="0" w:oddVBand="0" w:evenVBand="0" w:oddHBand="0" w:evenHBand="0" w:firstRowFirstColumn="0" w:firstRowLastColumn="0" w:lastRowFirstColumn="0" w:lastRowLastColumn="0"/>
+              <w:rPr>
+                <w:sz w:val="20"/>
+                <w:szCs w:val="20"/>
+                <w:lang w:val="nl-BE"/>
+              </w:rPr>
+            </w:pPr>
+            <w:r>
+              <w:rPr>
+                <w:sz w:val="20"/>
+                <w:szCs w:val="20"/>
+                <w:lang w:val="nl-BE"/>
+              </w:rPr>
+              <w:t>Merestraat 80, 9300 Aalst</w:t>
+            </w:r>
+          </w:p>
+        </w:tc>
+      </w:tr>
+      <w:tr>
+        <w:tc>
+          <w:tcPr>
+            <w:cnfStyle w:val="001000000000" w:firstRow="0" w:lastRow="0" w:firstColumn="1" w:lastColumn="0" w:oddVBand="0" w:evenVBand="0" w:oddHBand="0" w:evenHBand="0" w:firstRowFirstColumn="0" w:firstRowLastColumn="0" w:lastRowFirstColumn="0" w:lastRowLastColumn="0"/>
+            <w:tcW w:w="0" w:type="auto"/>
+            <w:hideMark/>
+          </w:tcPr>
+          <w:p>
+            <w:pPr>
+              <w:spacing w:before="120" w:after="60" w:line="259" w:lineRule="auto"/>
+              <w:jc w:val="both"/>
+              <w:rPr>
+                <w:b w:val="0"/>
+                <w:bCs w:val="0"/>
+                <w:sz w:val="20"/>
+                <w:szCs w:val="20"/>
+                <w:lang w:val="nl-BE"/>
+              </w:rPr>
+            </w:pPr>
+            <w:r>
+              <w:rPr>
+                <w:b w:val="0"/>
+                <w:bCs w:val="0"/>
+                <w:sz w:val="20"/>
+                <w:szCs w:val="20"/>
+                <w:lang w:val="nl-BE"/>
+              </w:rPr>
+              <w:t>AZ Sint-Jan Brugge</w:t>
+            </w:r>
+          </w:p>
+        </w:tc>
+        <w:tc>
+          <w:tcPr>
+            <w:tcW w:w="0" w:type="auto"/>
+            <w:hideMark/>
+          </w:tcPr>
+          <w:p>
+            <w:pPr>
+              <w:spacing w:before="120" w:after="60" w:line="259" w:lineRule="auto"/>
+              <w:jc w:val="both"/>
+              <w:cnfStyle w:val="000000000000" w:firstRow="0" w:lastRow="0" w:firstColumn="0" w:lastColumn="0" w:oddVBand="0" w:evenVBand="0" w:oddHBand="0" w:evenHBand="0" w:firstRowFirstColumn="0" w:firstRowLastColumn="0" w:lastRowFirstColumn="0" w:lastRowLastColumn="0"/>
+              <w:rPr>
+                <w:sz w:val="20"/>
+                <w:szCs w:val="20"/>
+                <w:lang w:val="nl-BE"/>
+              </w:rPr>
+            </w:pPr>
+            <w:hyperlink r:id="rId31" w:history="1">
+              <w:r>
+                <w:rPr>
+                  <w:rStyle w:val="Hyperlink"/>
+                  <w:sz w:val="20"/>
+                  <w:szCs w:val="20"/>
+                  <w:lang w:val="nl-BE"/>
+                </w:rPr>
+                <w:t>dpo@azsintjan.be</w:t>
+              </w:r>
+            </w:hyperlink>
+          </w:p>
+        </w:tc>
+        <w:tc>
+          <w:tcPr>
+            <w:tcW w:w="0" w:type="auto"/>
+            <w:hideMark/>
+          </w:tcPr>
+          <w:p>
+            <w:pPr>
+              <w:spacing w:before="120" w:after="60" w:line="259" w:lineRule="auto"/>
+              <w:jc w:val="both"/>
+              <w:cnfStyle w:val="000000000000" w:firstRow="0" w:lastRow="0" w:firstColumn="0" w:lastColumn="0" w:oddVBand="0" w:evenVBand="0" w:oddHBand="0" w:evenHBand="0" w:firstRowFirstColumn="0" w:firstRowLastColumn="0" w:lastRowFirstColumn="0" w:lastRowLastColumn="0"/>
+              <w:rPr>
+                <w:sz w:val="20"/>
+                <w:szCs w:val="20"/>
+                <w:lang w:val="nl-BE"/>
+              </w:rPr>
+            </w:pPr>
+            <w:r>
+              <w:rPr>
+                <w:sz w:val="20"/>
+                <w:szCs w:val="20"/>
+                <w:lang w:val="nl-BE"/>
+              </w:rPr>
+              <w:t>—</w:t>
+            </w:r>
+          </w:p>
+        </w:tc>
+        <w:tc>
+          <w:tcPr>
+            <w:tcW w:w="0" w:type="auto"/>
+            <w:hideMark/>
+          </w:tcPr>
+          <w:p>
+            <w:pPr>
+              <w:spacing w:before="120" w:after="60" w:line="259" w:lineRule="auto"/>
+              <w:jc w:val="both"/>
+              <w:cnfStyle w:val="000000000000" w:firstRow="0" w:lastRow="0" w:firstColumn="0" w:lastColumn="0" w:oddVBand="0" w:evenVBand="0" w:oddHBand="0" w:evenHBand="0" w:firstRowFirstColumn="0" w:firstRowLastColumn="0" w:lastRowFirstColumn="0" w:lastRowLastColumn="0"/>
+              <w:rPr>
+                <w:sz w:val="20"/>
+                <w:szCs w:val="20"/>
+                <w:lang w:val="nl-BE"/>
+              </w:rPr>
+            </w:pPr>
+            <w:proofErr w:type="spellStart"/>
+            <w:r>
+              <w:rPr>
+                <w:sz w:val="20"/>
+                <w:szCs w:val="20"/>
+                <w:lang w:val="nl-BE"/>
+              </w:rPr>
+              <w:t>Ruddershove</w:t>
+            </w:r>
+            <w:proofErr w:type="spellEnd"/>
+            <w:r>
+              <w:rPr>
+                <w:sz w:val="20"/>
+                <w:szCs w:val="20"/>
+                <w:lang w:val="nl-BE"/>
+              </w:rPr>
+              <w:t xml:space="preserve"> 10, 8000 Brugge</w:t>
+            </w:r>
+          </w:p>
+        </w:tc>
+      </w:tr>
+      <w:tr>
+        <w:tc>
+          <w:tcPr>
+            <w:cnfStyle w:val="001000000000" w:firstRow="0" w:lastRow="0" w:firstColumn="1" w:lastColumn="0" w:oddVBand="0" w:evenVBand="0" w:oddHBand="0" w:evenHBand="0" w:firstRowFirstColumn="0" w:firstRowLastColumn="0" w:lastRowFirstColumn="0" w:lastRowLastColumn="0"/>
+            <w:tcW w:w="0" w:type="auto"/>
+            <w:hideMark/>
+          </w:tcPr>
+          <w:p>
+            <w:pPr>
+              <w:spacing w:before="120" w:after="60" w:line="259" w:lineRule="auto"/>
+              <w:jc w:val="both"/>
+              <w:rPr>
+                <w:b w:val="0"/>
+                <w:bCs w:val="0"/>
+                <w:sz w:val="20"/>
+                <w:szCs w:val="20"/>
+                <w:lang w:val="nl-BE"/>
+              </w:rPr>
+            </w:pPr>
+            <w:r>
+              <w:rPr>
+                <w:b w:val="0"/>
+                <w:bCs w:val="0"/>
+                <w:sz w:val="20"/>
+                <w:szCs w:val="20"/>
+                <w:lang w:val="nl-BE"/>
+              </w:rPr>
+              <w:t>AZ</w:t>
+            </w:r>
+            <w:r>
+              <w:rPr>
+                <w:b w:val="0"/>
+                <w:bCs w:val="0"/>
+                <w:sz w:val="20"/>
+                <w:szCs w:val="20"/>
+                <w:lang w:val="nl-BE"/>
+              </w:rPr>
+              <w:t xml:space="preserve"> </w:t>
+            </w:r>
+            <w:r>
+              <w:rPr>
+                <w:b w:val="0"/>
+                <w:bCs w:val="0"/>
+                <w:sz w:val="20"/>
+                <w:szCs w:val="20"/>
+                <w:lang w:val="nl-BE"/>
+              </w:rPr>
+              <w:t>Groeninge Kortrijk</w:t>
+            </w:r>
+          </w:p>
+        </w:tc>
+        <w:tc>
+          <w:tcPr>
+            <w:tcW w:w="0" w:type="auto"/>
+            <w:hideMark/>
+          </w:tcPr>
+          <w:p>
+            <w:pPr>
+              <w:spacing w:before="120" w:after="60" w:line="259" w:lineRule="auto"/>
+              <w:jc w:val="both"/>
+              <w:cnfStyle w:val="000000000000" w:firstRow="0" w:lastRow="0" w:firstColumn="0" w:lastColumn="0" w:oddVBand="0" w:evenVBand="0" w:oddHBand="0" w:evenHBand="0" w:firstRowFirstColumn="0" w:firstRowLastColumn="0" w:lastRowFirstColumn="0" w:lastRowLastColumn="0"/>
+              <w:rPr>
+                <w:sz w:val="20"/>
+                <w:szCs w:val="20"/>
+                <w:lang w:val="nl-BE"/>
+              </w:rPr>
+            </w:pPr>
+            <w:hyperlink r:id="rId32" w:history="1">
+              <w:r>
+                <w:rPr>
+                  <w:rStyle w:val="Hyperlink"/>
+                  <w:sz w:val="20"/>
+                  <w:szCs w:val="20"/>
+                  <w:lang w:val="nl-BE"/>
+                </w:rPr>
+                <w:t>dpo@azgroeninge.be</w:t>
+              </w:r>
+            </w:hyperlink>
+          </w:p>
+        </w:tc>
+        <w:tc>
+          <w:tcPr>
+            <w:tcW w:w="0" w:type="auto"/>
+            <w:hideMark/>
+          </w:tcPr>
+          <w:p>
+            <w:pPr>
+              <w:spacing w:before="120" w:after="60" w:line="259" w:lineRule="auto"/>
+              <w:jc w:val="both"/>
+              <w:cnfStyle w:val="000000000000" w:firstRow="0" w:lastRow="0" w:firstColumn="0" w:lastColumn="0" w:oddVBand="0" w:evenVBand="0" w:oddHBand="0" w:evenHBand="0" w:firstRowFirstColumn="0" w:firstRowLastColumn="0" w:lastRowFirstColumn="0" w:lastRowLastColumn="0"/>
+              <w:rPr>
+                <w:sz w:val="20"/>
+                <w:szCs w:val="20"/>
+                <w:lang w:val="nl-BE"/>
+              </w:rPr>
+            </w:pPr>
+            <w:r>
+              <w:rPr>
+                <w:sz w:val="20"/>
+                <w:szCs w:val="20"/>
+                <w:lang w:val="nl-BE"/>
+              </w:rPr>
+              <w:t>056 63 60 26</w:t>
+            </w:r>
+          </w:p>
+        </w:tc>
+        <w:tc>
+          <w:tcPr>
+            <w:tcW w:w="0" w:type="auto"/>
+            <w:hideMark/>
+          </w:tcPr>
+          <w:p>
+            <w:pPr>
+              <w:spacing w:before="120" w:after="60" w:line="259" w:lineRule="auto"/>
+              <w:jc w:val="both"/>
+              <w:cnfStyle w:val="000000000000" w:firstRow="0" w:lastRow="0" w:firstColumn="0" w:lastColumn="0" w:oddVBand="0" w:evenVBand="0" w:oddHBand="0" w:evenHBand="0" w:firstRowFirstColumn="0" w:firstRowLastColumn="0" w:lastRowFirstColumn="0" w:lastRowLastColumn="0"/>
+              <w:rPr>
+                <w:sz w:val="20"/>
+                <w:szCs w:val="20"/>
+                <w:lang w:val="nl-BE"/>
+              </w:rPr>
+            </w:pPr>
+            <w:r>
+              <w:rPr>
+                <w:sz w:val="20"/>
+                <w:szCs w:val="20"/>
+                <w:lang w:val="nl-BE"/>
+              </w:rPr>
+              <w:t>President Kennedylaan 4, 8500 Kortrijk</w:t>
+            </w:r>
+          </w:p>
+        </w:tc>
+      </w:tr>
+    </w:tbl>
     <w:p>
       <w:pPr>
         <w:autoSpaceDE w:val="0"/>
@@ -6418,30 +7445,17 @@
         </w:rPr>
         <w:t xml:space="preserve">Website: </w:t>
       </w:r>
-      <w:r>
-        <w:fldChar w:fldCharType="begin"/>
-      </w:r>
-      <w:r>
-        <w:rPr>
-          <w:lang w:val="nl-BE"/>
-        </w:rPr>
-        <w:instrText>HYPERLINK "http://www.gegevensbeschermingsautoriteit.be"</w:instrText>
-      </w:r>
-      <w:r>
-        <w:fldChar w:fldCharType="separate"/>
-      </w:r>
-      <w:r>
-        <w:rPr>
-          <w:rStyle w:val="Hyperlink"/>
-          <w:sz w:val="20"/>
-          <w:szCs w:val="20"/>
-          <w:lang w:val="nl-BE"/>
-        </w:rPr>
-        <w:t>www.gegevensbeschermingsautoriteit.be</w:t>
-      </w:r>
-      <w:r>
-        <w:fldChar w:fldCharType="end"/>
-      </w:r>
+      <w:hyperlink r:id="rId33" w:history="1">
+        <w:r>
+          <w:rPr>
+            <w:rStyle w:val="Hyperlink"/>
+            <w:sz w:val="20"/>
+            <w:szCs w:val="20"/>
+            <w:lang w:val="nl-BE"/>
+          </w:rPr>
+          <w:t>www.gegevensbeschermingsautoriteit.be</w:t>
+        </w:r>
+      </w:hyperlink>
       <w:r>
         <w:rPr>
           <w:color w:val="24303B"/>
@@ -7028,8 +8042,11 @@
     </w:p>
     <w:p>
       <w:pPr>
-        <w:jc w:val="both"/>
-        <w:rPr>
+        <w:spacing w:after="60"/>
+        <w:jc w:val="both"/>
+        <w:rPr>
+          <w:sz w:val="20"/>
+          <w:szCs w:val="20"/>
           <w:lang w:val="nl-BE"/>
         </w:rPr>
       </w:pPr>
@@ -7328,16 +8345,6 @@
         <w:rPr>
           <w:sz w:val="20"/>
           <w:szCs w:val="20"/>
-          <w:lang w:val="nl-BE"/>
-        </w:rPr>
-      </w:pPr>
-    </w:p>
-    <w:p>
-      <w:pPr>
-        <w:jc w:val="both"/>
-        <w:rPr>
-          <w:sz w:val="20"/>
-          <w:szCs w:val="20"/>
           <w:u w:val="single"/>
           <w:lang w:val="nl-BE"/>
         </w:rPr>
@@ -7445,9 +8452,9 @@
           <w:szCs w:val="20"/>
           <w:lang w:val="nl-BE"/>
         </w:rPr>
-        <w:lastRenderedPageBreak/>
         <w:t xml:space="preserve">Telefoonnummer: </w:t>
       </w:r>
+      <w:proofErr w:type="gramStart"/>
       <w:r>
         <w:rPr>
           <w:color w:val="EE0000"/>
@@ -7457,16 +8464,55 @@
         </w:rPr>
         <w:t>XXXXXXXXXX</w:t>
       </w:r>
-    </w:p>
-    <w:p>
-      <w:pPr>
-        <w:jc w:val="both"/>
-        <w:rPr>
-          <w:sz w:val="20"/>
-          <w:szCs w:val="20"/>
-          <w:lang w:val="nl-BE"/>
-        </w:rPr>
-      </w:pPr>
+      <w:r>
+        <w:rPr>
+          <w:sz w:val="20"/>
+          <w:szCs w:val="20"/>
+          <w:lang w:val="nl-BE"/>
+        </w:rPr>
+        <w:t xml:space="preserve">  </w:t>
+      </w:r>
+      <w:r>
+        <w:rPr>
+          <w:sz w:val="20"/>
+          <w:szCs w:val="20"/>
+          <w:lang w:val="nl-BE"/>
+        </w:rPr>
+        <w:tab/>
+      </w:r>
+      <w:proofErr w:type="gramEnd"/>
+      <w:r>
+        <w:rPr>
+          <w:sz w:val="20"/>
+          <w:szCs w:val="20"/>
+          <w:lang w:val="nl-BE"/>
+        </w:rPr>
+        <w:tab/>
+      </w:r>
+      <w:r>
+        <w:rPr>
+          <w:sz w:val="20"/>
+          <w:szCs w:val="20"/>
+          <w:lang w:val="nl-BE"/>
+        </w:rPr>
+        <w:tab/>
+      </w:r>
+      <w:r>
+        <w:rPr>
+          <w:sz w:val="20"/>
+          <w:szCs w:val="20"/>
+          <w:lang w:val="nl-BE"/>
+        </w:rPr>
+        <w:tab/>
+      </w:r>
+      <w:r>
+        <w:rPr>
+          <w:sz w:val="20"/>
+          <w:szCs w:val="20"/>
+          <w:lang w:val="nl-BE"/>
+        </w:rPr>
+        <w:tab/>
+      </w:r>
       <w:r>
         <w:rPr>
           <w:color w:val="24303B"/>
@@ -7504,6 +8550,7 @@
           <w:color w:val="123A5F"/>
           <w:lang w:val="nl-BE"/>
         </w:rPr>
+        <w:lastRenderedPageBreak/>
         <w:t xml:space="preserve">Geïnformeerde toestemming </w:t>
       </w:r>
       <w:r>
@@ -7930,23 +8977,21 @@
     <w:p>
       <w:pPr>
         <w:pStyle w:val="paragraph"/>
-        <w:spacing w:before="0" w:beforeAutospacing="0" w:after="120" w:afterAutospacing="0"/>
-        <w:jc w:val="both"/>
+        <w:spacing w:before="0" w:beforeAutospacing="0" w:after="0" w:afterAutospacing="0"/>
         <w:textAlignment w:val="baseline"/>
         <w:rPr>
-          <w:rStyle w:val="eop"/>
           <w:sz w:val="18"/>
           <w:szCs w:val="18"/>
         </w:rPr>
       </w:pPr>
       <w:r>
         <w:rPr>
-          <w:rStyle w:val="eop"/>
-          <w:color w:val="24303B"/>
-          <w:sz w:val="20"/>
-          <w:szCs w:val="20"/>
-        </w:rPr>
-        <w:t> </w:t>
+          <w:rStyle w:val="normaltextrun"/>
+          <w:color w:val="24303B"/>
+          <w:sz w:val="20"/>
+          <w:szCs w:val="20"/>
+        </w:rPr>
+        <w:t>Naam, voornaam, datum en handtekening van de deelnemer</w:t>
       </w:r>
     </w:p>
     <w:p>
@@ -7961,12 +9006,12 @@
       </w:pPr>
       <w:r>
         <w:rPr>
-          <w:rStyle w:val="normaltextrun"/>
-          <w:color w:val="24303B"/>
-          <w:sz w:val="20"/>
-          <w:szCs w:val="20"/>
-        </w:rPr>
-        <w:t>Naam, voornaam, datum en handtekening van de deelnemer</w:t>
+          <w:rStyle w:val="eop"/>
+          <w:color w:val="24303B"/>
+          <w:sz w:val="20"/>
+          <w:szCs w:val="20"/>
+        </w:rPr>
+        <w:t> </w:t>
       </w:r>
     </w:p>
     <w:p>
@@ -7981,18 +9026,47 @@
       </w:pPr>
       <w:r>
         <w:rPr>
-          <w:rStyle w:val="eop"/>
-          <w:color w:val="24303B"/>
-          <w:sz w:val="20"/>
-          <w:szCs w:val="20"/>
-        </w:rPr>
-        <w:t> </w:t>
+          <w:rStyle w:val="normaltextrun"/>
+          <w:color w:val="24303B"/>
+          <w:sz w:val="20"/>
+          <w:szCs w:val="20"/>
+        </w:rPr>
+        <w:t>……………………………………………</w:t>
+      </w:r>
+      <w:r>
+        <w:rPr>
+          <w:rStyle w:val="normaltextrun"/>
+          <w:color w:val="24303B"/>
+          <w:sz w:val="20"/>
+          <w:szCs w:val="20"/>
+        </w:rPr>
+        <w:tab/>
+      </w:r>
+      <w:r>
+        <w:rPr>
+          <w:rStyle w:val="normaltextrun"/>
+          <w:color w:val="24303B"/>
+          <w:sz w:val="20"/>
+          <w:szCs w:val="20"/>
+        </w:rPr>
+        <w:tab/>
+      </w:r>
+      <w:r>
+        <w:rPr>
+          <w:rStyle w:val="normaltextrun"/>
+          <w:color w:val="24303B"/>
+          <w:sz w:val="20"/>
+          <w:szCs w:val="20"/>
+        </w:rPr>
+        <w:tab/>
+        <w:t>Datum: ………………………….</w:t>
       </w:r>
     </w:p>
     <w:p>
       <w:pPr>
         <w:pStyle w:val="paragraph"/>
         <w:spacing w:before="0" w:beforeAutospacing="0" w:after="0" w:afterAutospacing="0"/>
+        <w:jc w:val="both"/>
         <w:textAlignment w:val="baseline"/>
         <w:rPr>
           <w:sz w:val="18"/>
@@ -8001,40 +9075,12 @@
       </w:pPr>
       <w:r>
         <w:rPr>
-          <w:rStyle w:val="normaltextrun"/>
-          <w:color w:val="24303B"/>
-          <w:sz w:val="20"/>
-          <w:szCs w:val="20"/>
-        </w:rPr>
-        <w:t>……………………………………………</w:t>
-      </w:r>
-      <w:r>
-        <w:rPr>
-          <w:rStyle w:val="normaltextrun"/>
-          <w:color w:val="24303B"/>
-          <w:sz w:val="20"/>
-          <w:szCs w:val="20"/>
-        </w:rPr>
-        <w:tab/>
-      </w:r>
-      <w:r>
-        <w:rPr>
-          <w:rStyle w:val="normaltextrun"/>
-          <w:color w:val="24303B"/>
-          <w:sz w:val="20"/>
-          <w:szCs w:val="20"/>
-        </w:rPr>
-        <w:tab/>
-      </w:r>
-      <w:r>
-        <w:rPr>
-          <w:rStyle w:val="normaltextrun"/>
-          <w:color w:val="24303B"/>
-          <w:sz w:val="20"/>
-          <w:szCs w:val="20"/>
-        </w:rPr>
-        <w:tab/>
-        <w:t>Datum: ………………………….</w:t>
+          <w:rStyle w:val="eop"/>
+          <w:color w:val="24303B"/>
+          <w:sz w:val="20"/>
+          <w:szCs w:val="20"/>
+        </w:rPr>
+        <w:t> </w:t>
       </w:r>
     </w:p>
     <w:p>
@@ -8055,7 +9101,7 @@
           <w:sz w:val="20"/>
           <w:szCs w:val="20"/>
         </w:rPr>
-        <w:t> </w:t>
+        <w:t>  </w:t>
       </w:r>
     </w:p>
     <w:p>
@@ -8065,6 +9111,19 @@
         <w:jc w:val="both"/>
         <w:textAlignment w:val="baseline"/>
         <w:rPr>
+          <w:rStyle w:val="eop"/>
+          <w:sz w:val="20"/>
+          <w:szCs w:val="20"/>
+        </w:rPr>
+      </w:pPr>
+    </w:p>
+    <w:p>
+      <w:pPr>
+        <w:pStyle w:val="paragraph"/>
+        <w:spacing w:before="0" w:beforeAutospacing="0" w:after="0" w:afterAutospacing="0"/>
+        <w:jc w:val="both"/>
+        <w:textAlignment w:val="baseline"/>
+        <w:rPr>
           <w:sz w:val="18"/>
           <w:szCs w:val="18"/>
         </w:rPr>
@@ -8076,45 +9135,11 @@
           <w:sz w:val="20"/>
           <w:szCs w:val="20"/>
         </w:rPr>
-        <w:t>  </w:t>
-      </w:r>
-    </w:p>
-    <w:p>
-      <w:pPr>
-        <w:pStyle w:val="paragraph"/>
-        <w:spacing w:before="0" w:beforeAutospacing="0" w:after="0" w:afterAutospacing="0"/>
-        <w:jc w:val="both"/>
-        <w:textAlignment w:val="baseline"/>
+        <w:t>……………………………………………..</w:t>
+      </w:r>
+      <w:r>
         <w:rPr>
           <w:rStyle w:val="eop"/>
-          <w:sz w:val="20"/>
-          <w:szCs w:val="20"/>
-        </w:rPr>
-      </w:pPr>
-    </w:p>
-    <w:p>
-      <w:pPr>
-        <w:pStyle w:val="paragraph"/>
-        <w:spacing w:before="0" w:beforeAutospacing="0" w:after="0" w:afterAutospacing="0"/>
-        <w:jc w:val="both"/>
-        <w:textAlignment w:val="baseline"/>
-        <w:rPr>
-          <w:sz w:val="18"/>
-          <w:szCs w:val="18"/>
-        </w:rPr>
-      </w:pPr>
-      <w:r>
-        <w:rPr>
-          <w:rStyle w:val="eop"/>
-          <w:color w:val="24303B"/>
-          <w:sz w:val="20"/>
-          <w:szCs w:val="20"/>
-        </w:rPr>
-        <w:t>……………………………………………..</w:t>
-      </w:r>
-      <w:r>
-        <w:rPr>
-          <w:rStyle w:val="eop"/>
           <w:color w:val="24303B"/>
           <w:sz w:val="20"/>
           <w:szCs w:val="20"/>
@@ -8123,7 +9148,7 @@
       </w:r>
       <w:r>
         <w:rPr>
-          <w:rStyle w:val="eop"/>
+          <w:rStyle w:val="tabchar"/>
           <w:color w:val="24303B"/>
           <w:sz w:val="20"/>
           <w:szCs w:val="20"/>
@@ -8141,21 +9166,12 @@
       </w:r>
       <w:r>
         <w:rPr>
-          <w:rStyle w:val="tabchar"/>
-          <w:color w:val="24303B"/>
-          <w:sz w:val="20"/>
-          <w:szCs w:val="20"/>
-        </w:rPr>
-        <w:tab/>
-      </w:r>
-      <w:r>
-        <w:rPr>
-          <w:rStyle w:val="tabchar"/>
-          <w:color w:val="24303B"/>
-          <w:sz w:val="20"/>
-          <w:szCs w:val="20"/>
-        </w:rPr>
-        <w:tab/>
+          <w:rStyle w:val="normaltextrun"/>
+          <w:color w:val="24303B"/>
+          <w:sz w:val="20"/>
+          <w:szCs w:val="20"/>
+        </w:rPr>
+        <w:t>Datum: …………………………...</w:t>
       </w:r>
       <w:r>
         <w:rPr>
@@ -8272,15 +9288,6 @@
           <w:szCs w:val="20"/>
         </w:rPr>
         <w:t xml:space="preserve">XXXXXXX                                                                  </w:t>
-      </w:r>
-      <w:r>
-        <w:rPr>
-          <w:rStyle w:val="normaltextrun"/>
-          <w:color w:val="24303B"/>
-          <w:sz w:val="20"/>
-          <w:szCs w:val="20"/>
-        </w:rPr>
-        <w:t>Datum: …………………………...</w:t>
       </w:r>
     </w:p>
     <w:p>
@@ -8316,27 +9323,6 @@
     </w:p>
     <w:p>
       <w:pPr>
-        <w:pStyle w:val="paragraph"/>
-        <w:spacing w:before="0" w:beforeAutospacing="0" w:after="0" w:afterAutospacing="0"/>
-        <w:jc w:val="both"/>
-        <w:textAlignment w:val="baseline"/>
-        <w:rPr>
-          <w:sz w:val="20"/>
-          <w:szCs w:val="20"/>
-        </w:rPr>
-      </w:pPr>
-      <w:r>
-        <w:rPr>
-          <w:rStyle w:val="eop"/>
-          <w:color w:val="24303B"/>
-          <w:sz w:val="20"/>
-          <w:szCs w:val="20"/>
-        </w:rPr>
-        <w:t> </w:t>
-      </w:r>
-    </w:p>
-    <w:p>
-      <w:pPr>
         <w:spacing w:after="60"/>
         <w:jc w:val="both"/>
         <w:rPr>
@@ -8569,7 +9555,16 @@
           <w:szCs w:val="20"/>
           <w:lang w:val="nl-BE"/>
         </w:rPr>
-        <w:t>Datum:…</w:t>
+        <w:t>Datum:</w:t>
+      </w:r>
+      <w:r>
+        <w:rPr>
+          <w:color w:val="24303B"/>
+          <w:sz w:val="20"/>
+          <w:szCs w:val="20"/>
+          <w:lang w:val="nl-BE"/>
+        </w:rPr>
+        <w:t>…</w:t>
       </w:r>
       <w:proofErr w:type="gramEnd"/>
       <w:r>
@@ -8579,7 +9574,7 @@
           <w:szCs w:val="20"/>
           <w:lang w:val="nl-BE"/>
         </w:rPr>
-        <w:t>………………………</w:t>
+        <w:t>……………………</w:t>
       </w:r>
     </w:p>
     <w:p>
@@ -8620,6 +9615,7 @@
           <w:color w:val="123A5F"/>
           <w:lang w:val="nl-BE"/>
         </w:rPr>
+        <w:lastRenderedPageBreak/>
         <w:t>Geïnformeerde toestemming – Exemplaar onderzoeksteam</w:t>
       </w:r>
     </w:p>
@@ -9012,6 +10008,7 @@
         <w:jc w:val="both"/>
         <w:textAlignment w:val="baseline"/>
         <w:rPr>
+          <w:rStyle w:val="eop"/>
           <w:sz w:val="20"/>
           <w:szCs w:val="20"/>
         </w:rPr>
@@ -9025,28 +10022,6 @@
         </w:rPr>
         <w:t>Ik heb een exemplaar ontvangen van de informatie aan de deelnemer en de geïnformeerde toestemming.</w:t>
       </w:r>
-      <w:r>
-        <w:rPr>
-          <w:rStyle w:val="eop"/>
-          <w:color w:val="24303B"/>
-          <w:sz w:val="20"/>
-          <w:szCs w:val="20"/>
-        </w:rPr>
-        <w:t> </w:t>
-      </w:r>
-    </w:p>
-    <w:p>
-      <w:pPr>
-        <w:pStyle w:val="paragraph"/>
-        <w:spacing w:before="0" w:beforeAutospacing="0" w:after="120" w:afterAutospacing="0"/>
-        <w:jc w:val="both"/>
-        <w:textAlignment w:val="baseline"/>
-        <w:rPr>
-          <w:rStyle w:val="eop"/>
-          <w:sz w:val="18"/>
-          <w:szCs w:val="18"/>
-        </w:rPr>
-      </w:pPr>
       <w:r>
         <w:rPr>
           <w:rStyle w:val="eop"/>
@@ -9376,9 +10351,12 @@
     <w:p>
       <w:pPr>
         <w:pStyle w:val="paragraph"/>
+        <w:tabs>
+          <w:tab w:val="left" w:pos="285"/>
+          <w:tab w:val="right" w:pos="7392"/>
+        </w:tabs>
         <w:spacing w:before="0" w:beforeAutospacing="0" w:after="0" w:afterAutospacing="0"/>
         <w:ind w:right="1680" w:hanging="4725"/>
-        <w:jc w:val="right"/>
         <w:textAlignment w:val="baseline"/>
         <w:rPr>
           <w:sz w:val="18"/>
@@ -9401,28 +10379,7 @@
           <w:sz w:val="20"/>
           <w:szCs w:val="20"/>
         </w:rPr>
-        <w:t> </w:t>
-      </w:r>
-    </w:p>
-    <w:p>
-      <w:pPr>
-        <w:pStyle w:val="paragraph"/>
-        <w:spacing w:before="0" w:beforeAutospacing="0" w:after="0" w:afterAutospacing="0"/>
-        <w:jc w:val="both"/>
-        <w:textAlignment w:val="baseline"/>
-        <w:rPr>
-          <w:sz w:val="20"/>
-          <w:szCs w:val="20"/>
-        </w:rPr>
-      </w:pPr>
-      <w:r>
-        <w:rPr>
-          <w:rStyle w:val="eop"/>
-          <w:color w:val="24303B"/>
-          <w:sz w:val="20"/>
-          <w:szCs w:val="20"/>
-        </w:rPr>
-        <w:t> </w:t>
+        <w:t>  </w:t>
       </w:r>
     </w:p>
     <w:p>
@@ -9542,7 +10499,6 @@
           <w:szCs w:val="20"/>
           <w:lang w:val="nl-BE"/>
         </w:rPr>
-        <w:lastRenderedPageBreak/>
         <w:t xml:space="preserve">Ik bevestig dat ik werk in overeenstemming met de ethische beginselen zoals vermeld in de laatste versie van de "Verklaring van Helsinki", de "Goede klinische praktijk" en de Belgische wet van 7 mei 2004 </w:t>
       </w:r>
       <w:proofErr w:type="gramStart"/>
@@ -9642,7 +10598,16 @@
           <w:szCs w:val="20"/>
           <w:lang w:val="nl-BE"/>
         </w:rPr>
-        <w:t>Datum:…</w:t>
+        <w:t>Datum:</w:t>
+      </w:r>
+      <w:r>
+        <w:rPr>
+          <w:color w:val="24303B"/>
+          <w:sz w:val="20"/>
+          <w:szCs w:val="20"/>
+          <w:lang w:val="nl-BE"/>
+        </w:rPr>
+        <w:t>…</w:t>
       </w:r>
       <w:proofErr w:type="gramEnd"/>
       <w:r>
@@ -9652,7 +10617,7 @@
           <w:szCs w:val="20"/>
           <w:lang w:val="nl-BE"/>
         </w:rPr>
-        <w:t>………………………</w:t>
+        <w:t>……………………</w:t>
       </w:r>
     </w:p>
     <w:p>
@@ -9732,7 +10697,6 @@
         </w:rPr>
         <w:t xml:space="preserve">Naar een druk-, therapietrouw- en </w:t>
       </w:r>
-      <w:proofErr w:type="spellStart"/>
       <w:r>
         <w:rPr>
           <w:b/>
@@ -9742,9 +10706,8 @@
           <w:szCs w:val="20"/>
           <w:lang w:val="nl-NL"/>
         </w:rPr>
-        <w:t>educatiegestuurde</w:t>
-      </w:r>
-      <w:proofErr w:type="spellEnd"/>
+        <w:t>educatie gestuurde</w:t>
+      </w:r>
       <w:r>
         <w:rPr>
           <w:b/>
@@ -9819,44 +10782,52 @@
         <w:rPr>
           <w:sz w:val="20"/>
           <w:szCs w:val="20"/>
-        </w:rPr>
-      </w:pPr>
-      <w:r>
-        <w:rPr>
-          <w:color w:val="24303B"/>
-          <w:sz w:val="20"/>
-          <w:szCs w:val="20"/>
-        </w:rPr>
-        <w:t xml:space="preserve">Titel </w:t>
-      </w:r>
-      <w:proofErr w:type="spellStart"/>
-      <w:proofErr w:type="gramStart"/>
-      <w:r>
-        <w:rPr>
-          <w:color w:val="24303B"/>
-          <w:sz w:val="20"/>
-          <w:szCs w:val="20"/>
-        </w:rPr>
-        <w:t>studie</w:t>
-      </w:r>
-      <w:proofErr w:type="spellEnd"/>
-      <w:r>
-        <w:rPr>
-          <w:color w:val="24303B"/>
-          <w:sz w:val="20"/>
-          <w:szCs w:val="20"/>
-        </w:rPr>
-        <w:t>:</w:t>
-      </w:r>
-      <w:proofErr w:type="gramEnd"/>
-      <w:r>
-        <w:rPr>
-          <w:color w:val="24303B"/>
-          <w:sz w:val="20"/>
-          <w:szCs w:val="20"/>
-          <w:lang w:val="en-US"/>
-        </w:rPr>
-        <w:tab/>
+          <w:lang w:val="nl-BE"/>
+        </w:rPr>
+      </w:pPr>
+      <w:r>
+        <w:rPr>
+          <w:color w:val="24303B"/>
+          <w:sz w:val="20"/>
+          <w:szCs w:val="20"/>
+          <w:lang w:val="nl-BE"/>
+        </w:rPr>
+        <w:t>Titel studie:</w:t>
+      </w:r>
+      <w:r>
+        <w:rPr>
+          <w:b/>
+          <w:bCs/>
+          <w:color w:val="123A5F"/>
+          <w:sz w:val="20"/>
+          <w:szCs w:val="20"/>
+          <w:lang w:val="nl-NL"/>
+        </w:rPr>
+        <w:t xml:space="preserve"> </w:t>
+      </w:r>
+      <w:r>
+        <w:rPr>
+          <w:sz w:val="20"/>
+          <w:szCs w:val="20"/>
+          <w:lang w:val="nl-NL"/>
+        </w:rPr>
+        <w:t xml:space="preserve">Naar een druk-, therapietrouw- en </w:t>
+      </w:r>
+      <w:r>
+        <w:rPr>
+          <w:sz w:val="20"/>
+          <w:szCs w:val="20"/>
+          <w:lang w:val="nl-NL"/>
+        </w:rPr>
+        <w:t>educatie gestuurde</w:t>
+      </w:r>
+      <w:r>
+        <w:rPr>
+          <w:sz w:val="20"/>
+          <w:szCs w:val="20"/>
+          <w:lang w:val="nl-NL"/>
+        </w:rPr>
+        <w:t xml:space="preserve"> zorg bij diabetische voetaandoeningen</w:t>
       </w:r>
     </w:p>
     <w:p>
@@ -9874,34 +10845,27 @@
         <w:rPr>
           <w:sz w:val="20"/>
           <w:szCs w:val="20"/>
-        </w:rPr>
-      </w:pPr>
-      <w:r>
-        <w:rPr>
-          <w:color w:val="24303B"/>
-          <w:sz w:val="20"/>
-          <w:szCs w:val="20"/>
-        </w:rPr>
-        <w:t>Studie-/</w:t>
-      </w:r>
-      <w:proofErr w:type="spellStart"/>
+          <w:lang w:val="nl-BE"/>
+        </w:rPr>
+      </w:pPr>
+      <w:r>
+        <w:rPr>
+          <w:color w:val="24303B"/>
+          <w:sz w:val="20"/>
+          <w:szCs w:val="20"/>
+          <w:lang w:val="nl-BE"/>
+        </w:rPr>
+        <w:t xml:space="preserve">Studie-/protocolnummer: </w:t>
+      </w:r>
       <w:proofErr w:type="gramStart"/>
       <w:r>
         <w:rPr>
           <w:color w:val="24303B"/>
           <w:sz w:val="20"/>
           <w:szCs w:val="20"/>
-        </w:rPr>
-        <w:t>protocolnummer</w:t>
-      </w:r>
-      <w:proofErr w:type="spellEnd"/>
-      <w:r>
-        <w:rPr>
-          <w:color w:val="24303B"/>
-          <w:sz w:val="20"/>
-          <w:szCs w:val="20"/>
-        </w:rPr>
-        <w:t>:</w:t>
+          <w:lang w:val="nl-BE"/>
+        </w:rPr>
+        <w:t>CTC nummer</w:t>
       </w:r>
       <w:proofErr w:type="gramEnd"/>
       <w:r>
@@ -9909,17 +10873,9 @@
           <w:color w:val="24303B"/>
           <w:sz w:val="20"/>
           <w:szCs w:val="20"/>
-        </w:rPr>
-        <w:t xml:space="preserve"> </w:t>
-      </w:r>
-      <w:r>
-        <w:rPr>
-          <w:color w:val="24303B"/>
-          <w:sz w:val="20"/>
-          <w:szCs w:val="20"/>
-          <w:lang w:val="en-US"/>
-        </w:rPr>
-        <w:tab/>
+          <w:lang w:val="nl-BE"/>
+        </w:rPr>
+        <w:t xml:space="preserve"> S71769</w:t>
       </w:r>
     </w:p>
     <w:p>
@@ -11177,6 +12133,7 @@
           <w:sz w:val="20"/>
           <w:szCs w:val="20"/>
         </w:rPr>
+        <w:lastRenderedPageBreak/>
         <w:t>Totaalbedrag</w:t>
       </w:r>
       <w:proofErr w:type="spellEnd"/>
@@ -11221,7 +12178,6 @@
           <w:sz w:val="20"/>
           <w:szCs w:val="20"/>
         </w:rPr>
-        <w:lastRenderedPageBreak/>
         <w:t xml:space="preserve">Aantal </w:t>
       </w:r>
       <w:proofErr w:type="spellStart"/>
@@ -12379,9 +13335,9 @@
       </w:pPr>
     </w:p>
     <w:sectPr>
-      <w:headerReference w:type="default" r:id="rId24"/>
-      <w:footerReference w:type="default" r:id="rId25"/>
-      <w:headerReference w:type="first" r:id="rId26"/>
+      <w:headerReference w:type="default" r:id="rId34"/>
+      <w:footerReference w:type="default" r:id="rId35"/>
+      <w:headerReference w:type="first" r:id="rId36"/>
       <w:pgSz w:w="11906" w:h="16838"/>
       <w:pgMar w:top="1417" w:right="1417" w:bottom="1417" w:left="1417" w:header="708" w:footer="708" w:gutter="0"/>
       <w:cols w:space="708"/>
@@ -12404,12 +13360,15 @@
 </file>
 
 <file path=word/footer1.xml><?xml version="1.0" encoding="utf-8"?>
-<w:ftr xmlns:wpc="http://schemas.microsoft.com/office/word/2010/wordprocessingCanvas" xmlns:cx="http://schemas.microsoft.com/office/drawing/2014/chartex" xmlns:cx1="http://schemas.microsoft.com/office/drawing/2015/9/8/chartex" xmlns:cx2="http://schemas.microsoft.com/office/drawing/2015/10/21/chartex" xmlns:cx3="http://schemas.microsoft.com/office/drawing/2016/5/9/chartex" xmlns:cx4="http://schemas.microsoft.com/office/drawing/2016/5/10/chartex" xmlns:cx5="http://schemas.microsoft.com/office/drawing/2016/5/11/chartex" xmlns:cx6="http://schemas.microsoft.com/office/drawing/2016/5/12/chartex" xmlns:cx7="http://schemas.microsoft.com/office/drawing/2016/5/13/chartex" xmlns:cx8="http://schemas.microsoft.com/office/drawing/2016/5/14/chartex" xmlns:mc="http://schemas.openxmlformats.org/markup-compatibility/2006" xmlns:aink="http://schemas.microsoft.com/office/drawing/2016/ink" xmlns:am3d="http://schemas.microsoft.com/office/drawing/2017/model3d" xmlns:o="urn:schemas-microsoft-com:office:office" xmlns:oel="http://schemas.microsoft.com/office/2019/extlst" xmlns:r="http://schemas.openxmlformats.org/officeDocument/2006/relationships" xmlns:m="http://schemas.openxmlformats.org/officeDocument/2006/math" xmlns:v="urn:schemas-microsoft-com:vml" xmlns:wp14="http://schemas.microsoft.com/office/word/2010/wordprocessingDrawing" xmlns:wp="http://schemas.openxmlformats.org/drawingml/2006/wordprocessingDrawing" xmlns:w10="urn:schemas-microsoft-com:office:word" xmlns:w="http://schemas.openxmlformats.org/wordprocessingml/2006/main" xmlns:w14="http://schemas.microsoft.com/office/word/2010/wordml" xmlns:w15="http://schemas.microsoft.com/office/word/2012/wordml" xmlns:w16cex="http://schemas.microsoft.com/office/word/2018/wordml/cex" xmlns:w16cid="http://schemas.microsoft.com/office/word/2016/wordml/cid" xmlns:w16="http://schemas.microsoft.com/office/word/2018/wordml" xmlns:w16du="http://schemas.microsoft.com/office/word/2023/wordml/word16du" xmlns:w16sdtdh="http://schemas.microsoft.com/office/word/2020/wordml/sdtdatahash" xmlns:w16sdtfl="http://schemas.microsoft.com/office/word/2024/wordml/sdtformatlock" xmlns:w16se="http://schemas.microsoft.com/office/word/2015/wordml/symex" xmlns:wpg="http://schemas.microsoft.com/office/word/2010/wordprocessingGroup" xmlns:wpi="http://schemas.microsoft.com/office/word/2010/wordprocessingInk" xmlns:wne="http://schemas.microsoft.com/office/word/2006/wordml" xmlns:wps="http://schemas.microsoft.com/office/word/2010/wordprocessingShape" mc:Ignorable="w14 w15 w16se w16cid w16 w16cex w16sdtdh w16sdtfl w16du wp14">
+<w:ftr xmlns:wpc="http://schemas.microsoft.com/office/word/2010/wordprocessingCanvas" xmlns:cx="http://schemas.microsoft.com/office/drawing/2014/chartex" xmlns:cx1="http://schemas.microsoft.com/office/drawing/2015/9/8/chartex" xmlns:cx2="http://schemas.microsoft.com/office/drawing/2015/10/21/chartex" xmlns:cx3="http://schemas.microsoft.com/office/drawing/2016/5/9/chartex" xmlns:cx4="http://schemas.microsoft.com/office/drawing/2016/5/10/chartex" xmlns:cx5="http://schemas.microsoft.com/office/drawing/2016/5/11/chartex" xmlns:cx6="http://schemas.microsoft.com/office/drawing/2016/5/12/chartex" xmlns:cx7="http://schemas.microsoft.com/office/drawing/2016/5/13/chartex" xmlns:cx8="http://schemas.microsoft.com/office/drawing/2016/5/14/chartex" xmlns:mc="http://schemas.openxmlformats.org/markup-compatibility/2006" xmlns:aink="http://schemas.microsoft.com/office/drawing/2016/ink" xmlns:am3d="http://schemas.microsoft.com/office/drawing/2017/model3d" xmlns:o="urn:schemas-microsoft-com:office:office" xmlns:oel="http://schemas.microsoft.com/office/2019/extlst" xmlns:r="http://schemas.openxmlformats.org/officeDocument/2006/relationships" xmlns:m="http://schemas.openxmlformats.org/officeDocument/2006/math" xmlns:v="urn:schemas-microsoft-com:vml" xmlns:wp14="http://schemas.microsoft.com/office/word/2010/wordprocessingDrawing" xmlns:wp="http://schemas.openxmlformats.org/drawingml/2006/wordprocessingDrawing" xmlns:w10="urn:schemas-microsoft-com:office:word" xmlns:w="http://schemas.openxmlformats.org/wordprocessingml/2006/main" xmlns:w14="http://schemas.microsoft.com/office/word/2010/wordml" xmlns:w15="http://schemas.microsoft.com/office/word/2012/wordml" xmlns:w16cei="http://schemas.microsoft.com/office/word/2026/wordml/cei" xmlns:w16cex="http://schemas.microsoft.com/office/word/2018/wordml/cex" xmlns:w16cid="http://schemas.microsoft.com/office/word/2016/wordml/cid" xmlns:w16="http://schemas.microsoft.com/office/word/2018/wordml" xmlns:w16du="http://schemas.microsoft.com/office/word/2023/wordml/word16du" xmlns:w16sdtdh="http://schemas.microsoft.com/office/word/2020/wordml/sdtdatahash" xmlns:w16sdtfl="http://schemas.microsoft.com/office/word/2024/wordml/sdtformatlock" xmlns:w16se="http://schemas.microsoft.com/office/word/2015/wordml/symex" xmlns:wpg="http://schemas.microsoft.com/office/word/2010/wordprocessingGroup" xmlns:wpi="http://schemas.microsoft.com/office/word/2010/wordprocessingInk" xmlns:wne="http://schemas.microsoft.com/office/word/2006/wordml" xmlns:wps="http://schemas.microsoft.com/office/word/2010/wordprocessingShape" mc:Ignorable="w14 w15 w16se w16cid w16 w16cex w16sdtdh w16sdtfl w16du wp14">
   <w:p>
     <w:pPr>
       <w:pBdr>
         <w:top w:val="single" w:sz="6" w:space="6" w:color="C4CED8"/>
       </w:pBdr>
+      <w:rPr>
+        <w:lang w:val="nl-BE"/>
+      </w:rPr>
     </w:pPr>
     <w:r>
       <w:rPr>
@@ -12439,7 +13398,7 @@
                   <pic:cNvPicPr/>
                 </pic:nvPicPr>
                 <pic:blipFill rotWithShape="1">
-                  <a:blip r:embed="rIdTplImgC">
+                  <a:blip r:embed="rId1">
                     <a:extLst>
                       <a:ext uri="{28A0092B-C50C-407E-A947-70E740481C1C}">
                         <a14:useLocalDpi xmlns:a14="http://schemas.microsoft.com/office/drawing/2010/main" val="0"/>
@@ -12485,6 +13444,7 @@
         <w:color w:val="59636E"/>
         <w:sz w:val="16"/>
         <w:szCs w:val="16"/>
+        <w:lang w:val="nl-BE"/>
       </w:rPr>
       <w:t>PARADISE-</w:t>
     </w:r>
@@ -12494,6 +13454,7 @@
         <w:color w:val="59636E"/>
         <w:sz w:val="16"/>
         <w:szCs w:val="16"/>
+        <w:lang w:val="nl-BE"/>
       </w:rPr>
       <w:t>studie  ·</w:t>
     </w:r>
@@ -12503,8 +13464,29 @@
         <w:color w:val="59636E"/>
         <w:sz w:val="16"/>
         <w:szCs w:val="16"/>
-      </w:rPr>
-      <w:t xml:space="preserve">  eCRF 02: Toestemmingsformulier en kostenformulier (patient) </w:t>
+        <w:lang w:val="nl-BE"/>
+      </w:rPr>
+      <w:t xml:space="preserve">  eCRF 02: Toestemmingsformulier en kostenformulier (</w:t>
+    </w:r>
+    <w:proofErr w:type="spellStart"/>
+    <w:r>
+      <w:rPr>
+        <w:color w:val="59636E"/>
+        <w:sz w:val="16"/>
+        <w:szCs w:val="16"/>
+        <w:lang w:val="nl-BE"/>
+      </w:rPr>
+      <w:t>patient</w:t>
+    </w:r>
+    <w:proofErr w:type="spellEnd"/>
+    <w:r>
+      <w:rPr>
+        <w:color w:val="59636E"/>
+        <w:sz w:val="16"/>
+        <w:szCs w:val="16"/>
+        <w:lang w:val="nl-BE"/>
+      </w:rPr>
+      <w:t xml:space="preserve">) </w:t>
     </w:r>
     <w:proofErr w:type="gramStart"/>
     <w:r>
@@ -12512,8 +13494,9 @@
         <w:color w:val="59636E"/>
         <w:sz w:val="16"/>
         <w:szCs w:val="16"/>
-      </w:rPr>
-      <w:t>·</w:t>
+        <w:lang w:val="nl-BE"/>
+      </w:rPr>
+      <w:t>·  Versie</w:t>
     </w:r>
     <w:proofErr w:type="gramEnd"/>
     <w:r>
@@ -12521,8 +13504,9 @@
         <w:color w:val="59636E"/>
         <w:sz w:val="16"/>
         <w:szCs w:val="16"/>
-      </w:rPr>
-      <w:t xml:space="preserve">  Versie </w:t>
+        <w:lang w:val="nl-BE"/>
+      </w:rPr>
+      <w:t xml:space="preserve"> </w:t>
     </w:r>
     <w:proofErr w:type="gramStart"/>
     <w:r>
@@ -12532,6 +13516,7 @@
         <w:color w:val="59636E"/>
         <w:sz w:val="16"/>
         <w:szCs w:val="16"/>
+        <w:lang w:val="nl-BE"/>
       </w:rPr>
       <w:t xml:space="preserve">[ </w:t>
     </w:r>
@@ -12542,6 +13527,7 @@
         <w:color w:val="59636E"/>
         <w:sz w:val="16"/>
         <w:szCs w:val="16"/>
+        <w:lang w:val="nl-BE"/>
       </w:rPr>
       <w:t>1.0</w:t>
     </w:r>
@@ -12553,6 +13539,7 @@
         <w:color w:val="59636E"/>
         <w:sz w:val="16"/>
         <w:szCs w:val="16"/>
+        <w:lang w:val="nl-BE"/>
       </w:rPr>
       <w:t xml:space="preserve"> </w:t>
     </w:r>
@@ -12564,6 +13551,7 @@
         <w:color w:val="59636E"/>
         <w:sz w:val="16"/>
         <w:szCs w:val="16"/>
+        <w:lang w:val="nl-BE"/>
       </w:rPr>
       <w:t>]</w:t>
     </w:r>
@@ -12572,6 +13560,7 @@
         <w:color w:val="59636E"/>
         <w:sz w:val="16"/>
         <w:szCs w:val="16"/>
+        <w:lang w:val="nl-BE"/>
       </w:rPr>
       <w:t xml:space="preserve">  ·</w:t>
     </w:r>
@@ -12581,6 +13570,7 @@
         <w:color w:val="59636E"/>
         <w:sz w:val="16"/>
         <w:szCs w:val="16"/>
+        <w:lang w:val="nl-BE"/>
       </w:rPr>
       <w:t xml:space="preserve">  </w:t>
     </w:r>
@@ -12592,6 +13582,7 @@
         <w:color w:val="59636E"/>
         <w:sz w:val="16"/>
         <w:szCs w:val="16"/>
+        <w:lang w:val="nl-BE"/>
       </w:rPr>
       <w:t xml:space="preserve">[ </w:t>
     </w:r>
@@ -12602,6 +13593,7 @@
         <w:color w:val="59636E"/>
         <w:sz w:val="16"/>
         <w:szCs w:val="16"/>
+        <w:lang w:val="nl-BE"/>
       </w:rPr>
       <w:t>27</w:t>
     </w:r>
@@ -12613,6 +13605,7 @@
         <w:color w:val="59636E"/>
         <w:sz w:val="16"/>
         <w:szCs w:val="16"/>
+        <w:lang w:val="nl-BE"/>
       </w:rPr>
       <w:t>/07/</w:t>
     </w:r>
@@ -12624,6 +13617,7 @@
         <w:color w:val="59636E"/>
         <w:sz w:val="16"/>
         <w:szCs w:val="16"/>
+        <w:lang w:val="nl-BE"/>
       </w:rPr>
       <w:t>2026</w:t>
     </w:r>
@@ -12634,6 +13628,7 @@
         <w:color w:val="59636E"/>
         <w:sz w:val="16"/>
         <w:szCs w:val="16"/>
+        <w:lang w:val="nl-BE"/>
       </w:rPr>
       <w:t xml:space="preserve"> ]</w:t>
     </w:r>
@@ -12643,6 +13638,7 @@
         <w:color w:val="59636E"/>
         <w:sz w:val="16"/>
         <w:szCs w:val="16"/>
+        <w:lang w:val="nl-BE"/>
       </w:rPr>
       <w:t xml:space="preserve">  </w:t>
     </w:r>
@@ -12652,6 +13648,7 @@
         <w:color w:val="59636E"/>
         <w:sz w:val="16"/>
         <w:szCs w:val="16"/>
+        <w:lang w:val="nl-BE"/>
       </w:rPr>
       <w:t>·  Pagina</w:t>
     </w:r>
@@ -12661,6 +13658,7 @@
         <w:color w:val="59636E"/>
         <w:sz w:val="16"/>
         <w:szCs w:val="16"/>
+        <w:lang w:val="nl-BE"/>
       </w:rPr>
       <w:t xml:space="preserve"> </w:t>
     </w:r>
@@ -12677,6 +13675,7 @@
         <w:color w:val="59636E"/>
         <w:sz w:val="16"/>
         <w:szCs w:val="16"/>
+        <w:lang w:val="nl-BE"/>
       </w:rPr>
       <w:instrText>PAGE</w:instrText>
     </w:r>
@@ -12694,6 +13693,7 @@
         <w:color w:val="59636E"/>
         <w:sz w:val="16"/>
         <w:szCs w:val="16"/>
+        <w:lang w:val="nl-BE"/>
       </w:rPr>
       <w:t>1</w:t>
     </w:r>
@@ -12710,6 +13710,7 @@
         <w:color w:val="59636E"/>
         <w:sz w:val="16"/>
         <w:szCs w:val="16"/>
+        <w:lang w:val="nl-BE"/>
       </w:rPr>
       <w:t xml:space="preserve"> van </w:t>
     </w:r>
@@ -12726,6 +13727,7 @@
         <w:color w:val="59636E"/>
         <w:sz w:val="16"/>
         <w:szCs w:val="16"/>
+        <w:lang w:val="nl-BE"/>
       </w:rPr>
       <w:instrText>NUMPAGES</w:instrText>
     </w:r>
@@ -12743,6 +13745,7 @@
         <w:color w:val="59636E"/>
         <w:sz w:val="16"/>
         <w:szCs w:val="16"/>
+        <w:lang w:val="nl-BE"/>
       </w:rPr>
       <w:t>2</w:t>
     </w:r>
@@ -12770,7 +13773,7 @@
 </file>
 
 <file path=word/header1.xml><?xml version="1.0" encoding="utf-8"?>
-<w:hdr xmlns:wpc="http://schemas.microsoft.com/office/word/2010/wordprocessingCanvas" xmlns:cx="http://schemas.microsoft.com/office/drawing/2014/chartex" xmlns:cx1="http://schemas.microsoft.com/office/drawing/2015/9/8/chartex" xmlns:cx2="http://schemas.microsoft.com/office/drawing/2015/10/21/chartex" xmlns:cx3="http://schemas.microsoft.com/office/drawing/2016/5/9/chartex" xmlns:cx4="http://schemas.microsoft.com/office/drawing/2016/5/10/chartex" xmlns:cx5="http://schemas.microsoft.com/office/drawing/2016/5/11/chartex" xmlns:cx6="http://schemas.microsoft.com/office/drawing/2016/5/12/chartex" xmlns:cx7="http://schemas.microsoft.com/office/drawing/2016/5/13/chartex" xmlns:cx8="http://schemas.microsoft.com/office/drawing/2016/5/14/chartex" xmlns:mc="http://schemas.openxmlformats.org/markup-compatibility/2006" xmlns:aink="http://schemas.microsoft.com/office/drawing/2016/ink" xmlns:am3d="http://schemas.microsoft.com/office/drawing/2017/model3d" xmlns:o="urn:schemas-microsoft-com:office:office" xmlns:oel="http://schemas.microsoft.com/office/2019/extlst" xmlns:r="http://schemas.openxmlformats.org/officeDocument/2006/relationships" xmlns:m="http://schemas.openxmlformats.org/officeDocument/2006/math" xmlns:v="urn:schemas-microsoft-com:vml" xmlns:wp14="http://schemas.microsoft.com/office/word/2010/wordprocessingDrawing" xmlns:wp="http://schemas.openxmlformats.org/drawingml/2006/wordprocessingDrawing" xmlns:w10="urn:schemas-microsoft-com:office:word" xmlns:w="http://schemas.openxmlformats.org/wordprocessingml/2006/main" xmlns:w14="http://schemas.microsoft.com/office/word/2010/wordml" xmlns:w15="http://schemas.microsoft.com/office/word/2012/wordml" xmlns:w16cex="http://schemas.microsoft.com/office/word/2018/wordml/cex" xmlns:w16cid="http://schemas.microsoft.com/office/word/2016/wordml/cid" xmlns:w16="http://schemas.microsoft.com/office/word/2018/wordml" xmlns:w16du="http://schemas.microsoft.com/office/word/2023/wordml/word16du" xmlns:w16sdtdh="http://schemas.microsoft.com/office/word/2020/wordml/sdtdatahash" xmlns:w16sdtfl="http://schemas.microsoft.com/office/word/2024/wordml/sdtformatlock" xmlns:w16se="http://schemas.microsoft.com/office/word/2015/wordml/symex" xmlns:wpg="http://schemas.microsoft.com/office/word/2010/wordprocessingGroup" xmlns:wpi="http://schemas.microsoft.com/office/word/2010/wordprocessingInk" xmlns:wne="http://schemas.microsoft.com/office/word/2006/wordml" xmlns:wps="http://schemas.microsoft.com/office/word/2010/wordprocessingShape" mc:Ignorable="w14 w15 w16se w16cid w16 w16cex w16sdtdh w16sdtfl w16du wp14">
+<w:hdr xmlns:wpc="http://schemas.microsoft.com/office/word/2010/wordprocessingCanvas" xmlns:cx="http://schemas.microsoft.com/office/drawing/2014/chartex" xmlns:cx1="http://schemas.microsoft.com/office/drawing/2015/9/8/chartex" xmlns:cx2="http://schemas.microsoft.com/office/drawing/2015/10/21/chartex" xmlns:cx3="http://schemas.microsoft.com/office/drawing/2016/5/9/chartex" xmlns:cx4="http://schemas.microsoft.com/office/drawing/2016/5/10/chartex" xmlns:cx5="http://schemas.microsoft.com/office/drawing/2016/5/11/chartex" xmlns:cx6="http://schemas.microsoft.com/office/drawing/2016/5/12/chartex" xmlns:cx7="http://schemas.microsoft.com/office/drawing/2016/5/13/chartex" xmlns:cx8="http://schemas.microsoft.com/office/drawing/2016/5/14/chartex" xmlns:mc="http://schemas.openxmlformats.org/markup-compatibility/2006" xmlns:aink="http://schemas.microsoft.com/office/drawing/2016/ink" xmlns:am3d="http://schemas.microsoft.com/office/drawing/2017/model3d" xmlns:o="urn:schemas-microsoft-com:office:office" xmlns:oel="http://schemas.microsoft.com/office/2019/extlst" xmlns:r="http://schemas.openxmlformats.org/officeDocument/2006/relationships" xmlns:m="http://schemas.openxmlformats.org/officeDocument/2006/math" xmlns:v="urn:schemas-microsoft-com:vml" xmlns:wp14="http://schemas.microsoft.com/office/word/2010/wordprocessingDrawing" xmlns:wp="http://schemas.openxmlformats.org/drawingml/2006/wordprocessingDrawing" xmlns:w10="urn:schemas-microsoft-com:office:word" xmlns:w="http://schemas.openxmlformats.org/wordprocessingml/2006/main" xmlns:w14="http://schemas.microsoft.com/office/word/2010/wordml" xmlns:w15="http://schemas.microsoft.com/office/word/2012/wordml" xmlns:w16cei="http://schemas.microsoft.com/office/word/2026/wordml/cei" xmlns:w16cex="http://schemas.microsoft.com/office/word/2018/wordml/cex" xmlns:w16cid="http://schemas.microsoft.com/office/word/2016/wordml/cid" xmlns:w16="http://schemas.microsoft.com/office/word/2018/wordml" xmlns:w16du="http://schemas.microsoft.com/office/word/2023/wordml/word16du" xmlns:w16sdtdh="http://schemas.microsoft.com/office/word/2020/wordml/sdtdatahash" xmlns:w16sdtfl="http://schemas.microsoft.com/office/word/2024/wordml/sdtformatlock" xmlns:w16se="http://schemas.microsoft.com/office/word/2015/wordml/symex" xmlns:wpg="http://schemas.microsoft.com/office/word/2010/wordprocessingGroup" xmlns:wpi="http://schemas.microsoft.com/office/word/2010/wordprocessingInk" xmlns:wne="http://schemas.microsoft.com/office/word/2006/wordml" xmlns:wps="http://schemas.microsoft.com/office/word/2010/wordprocessingShape" mc:Ignorable="w14 w15 w16se w16cid w16 w16cex w16sdtdh w16sdtfl w16du wp14">
   <w:p>
     <w:pPr>
       <w:pStyle w:val="Koptekst"/>
@@ -12817,7 +13820,7 @@
                   <pic:cNvPicPr/>
                 </pic:nvPicPr>
                 <pic:blipFill>
-                  <a:blip r:embed="rIdTplImgA">
+                  <a:blip r:embed="rId1">
                     <a:extLst>
                       <a:ext uri="{28A0092B-C50C-407E-A947-70E740481C1C}">
                         <a14:useLocalDpi xmlns:a14="http://schemas.microsoft.com/office/drawing/2010/main" val="0"/>
@@ -12869,7 +13872,7 @@
                   <pic:cNvPicPr/>
                 </pic:nvPicPr>
                 <pic:blipFill>
-                  <a:blip r:embed="rIdTplImgB">
+                  <a:blip r:embed="rId2">
                     <a:extLst>
                       <a:ext uri="{28A0092B-C50C-407E-A947-70E740481C1C}">
                         <a14:useLocalDpi xmlns:a14="http://schemas.microsoft.com/office/drawing/2010/main" val="0"/>
@@ -18832,7 +19835,7 @@
     <w:rPrDefault>
       <w:rPr>
         <w:rFonts w:ascii="Times New Roman" w:eastAsia="Times New Roman" w:hAnsi="Times New Roman" w:cs="Times New Roman"/>
-        <w:lang w:bidi="ar-SA"/>
+        <w:lang w:val="nl-BE" w:eastAsia="nl-BE" w:bidi="ar-SA"/>
       </w:rPr>
     </w:rPrDefault>
     <w:pPrDefault/>
@@ -19196,7 +20199,6 @@
   <w:style w:type="character" w:default="1" w:styleId="Standaardalinea-lettertype">
     <w:name w:val="Default Paragraph Font"/>
     <w:uiPriority w:val="1"/>
-    <w:semiHidden/>
     <w:unhideWhenUsed/>
   </w:style>
   <w:style w:type="table" w:default="1" w:styleId="Standaardtabel">
@@ -19610,6 +20612,60 @@
       <w:lang w:val="fr-FR" w:eastAsia="fr-FR"/>
     </w:rPr>
   </w:style>
+  <w:style w:type="table" w:styleId="Rastertabel1licht">
+    <w:name w:val="Grid Table 1 Light"/>
+    <w:basedOn w:val="Standaardtabel"/>
+    <w:uiPriority w:val="46"/>
+    <w:rsid w:val="00322651"/>
+    <w:tblPr>
+      <w:tblStyleRowBandSize w:val="1"/>
+      <w:tblStyleColBandSize w:val="1"/>
+      <w:tblBorders>
+        <w:top w:val="single" w:sz="4" w:space="0" w:color="999999" w:themeColor="text1" w:themeTint="66"/>
+        <w:left w:val="single" w:sz="4" w:space="0" w:color="999999" w:themeColor="text1" w:themeTint="66"/>
+        <w:bottom w:val="single" w:sz="4" w:space="0" w:color="999999" w:themeColor="text1" w:themeTint="66"/>
+        <w:right w:val="single" w:sz="4" w:space="0" w:color="999999" w:themeColor="text1" w:themeTint="66"/>
+        <w:insideH w:val="single" w:sz="4" w:space="0" w:color="999999" w:themeColor="text1" w:themeTint="66"/>
+        <w:insideV w:val="single" w:sz="4" w:space="0" w:color="999999" w:themeColor="text1" w:themeTint="66"/>
+      </w:tblBorders>
+    </w:tblPr>
+    <w:tblStylePr w:type="firstRow">
+      <w:rPr>
+        <w:b/>
+        <w:bCs/>
+      </w:rPr>
+      <w:tblPr/>
+      <w:tcPr>
+        <w:tcBorders>
+          <w:bottom w:val="single" w:sz="12" w:space="0" w:color="666666" w:themeColor="text1" w:themeTint="99"/>
+        </w:tcBorders>
+      </w:tcPr>
+    </w:tblStylePr>
+    <w:tblStylePr w:type="lastRow">
+      <w:rPr>
+        <w:b/>
+        <w:bCs/>
+      </w:rPr>
+      <w:tblPr/>
+      <w:tcPr>
+        <w:tcBorders>
+          <w:top w:val="double" w:sz="2" w:space="0" w:color="666666" w:themeColor="text1" w:themeTint="99"/>
+        </w:tcBorders>
+      </w:tcPr>
+    </w:tblStylePr>
+    <w:tblStylePr w:type="firstCol">
+      <w:rPr>
+        <w:b/>
+        <w:bCs/>
+      </w:rPr>
+    </w:tblStylePr>
+    <w:tblStylePr w:type="lastCol">
+      <w:rPr>
+        <w:b/>
+        <w:bCs/>
+      </w:rPr>
+    </w:tblStylePr>
+  </w:style>
 </w:styles>
 </file>
 
@@ -19929,18 +20985,18 @@
 </file>
 
 <file path=customXml/item1.xml><?xml version="1.0" encoding="utf-8"?>
-<p:properties xmlns:p="http://schemas.microsoft.com/office/2006/metadata/properties" xmlns:xsi="http://www.w3.org/2001/XMLSchema-instance" xmlns:pc="http://schemas.microsoft.com/office/infopath/2007/PartnerControls">
-  <documentManagement/>
-</p:properties>
-</file>
-
-<file path=customXml/item2.xml><?xml version="1.0" encoding="utf-8"?>
 <?mso-contentType ?>
 <FormTemplates xmlns="http://schemas.microsoft.com/sharepoint/v3/contenttype/forms">
   <Display>DocumentLibraryForm</Display>
   <Edit>DocumentLibraryForm</Edit>
   <New>DocumentLibraryForm</New>
 </FormTemplates>
+</file>
+
+<file path=customXml/item2.xml><?xml version="1.0" encoding="utf-8"?>
+<p:properties xmlns:p="http://schemas.microsoft.com/office/2006/metadata/properties" xmlns:xsi="http://www.w3.org/2001/XMLSchema-instance" xmlns:pc="http://schemas.microsoft.com/office/infopath/2007/PartnerControls">
+  <documentManagement/>
+</p:properties>
 </file>
 
 <file path=customXml/item3.xml><?xml version="1.0" encoding="utf-8"?>
@@ -20099,19 +21155,23 @@
 </ct:contentTypeSchema>
 </file>
 
+<file path=customXml/item4.xml><?xml version="1.0" encoding="utf-8"?>
+<b:Sources xmlns:b="http://schemas.openxmlformats.org/officeDocument/2006/bibliography" xmlns="http://schemas.openxmlformats.org/officeDocument/2006/bibliography" SelectedStyle="\APASixthEditionOfficeOnline.xsl" StyleName="APA" Version="6"/>
+</file>
+
 <file path=customXml/itemProps1.xml><?xml version="1.0" encoding="utf-8"?>
-<ds:datastoreItem xmlns:ds="http://schemas.openxmlformats.org/officeDocument/2006/customXml" ds:itemID="{37CEB06B-EFF0-4305-B5FA-2CE560D70941}">
+<ds:datastoreItem xmlns:ds="http://schemas.openxmlformats.org/officeDocument/2006/customXml" ds:itemID="{9B035D3D-E8F7-4603-821D-4ED3A43C6A05}">
   <ds:schemaRefs>
-    <ds:schemaRef ds:uri="http://schemas.microsoft.com/office/2006/metadata/properties"/>
-    <ds:schemaRef ds:uri="http://schemas.microsoft.com/office/infopath/2007/PartnerControls"/>
+    <ds:schemaRef ds:uri="http://schemas.microsoft.com/sharepoint/v3/contenttype/forms"/>
   </ds:schemaRefs>
 </ds:datastoreItem>
 </file>
 
 <file path=customXml/itemProps2.xml><?xml version="1.0" encoding="utf-8"?>
-<ds:datastoreItem xmlns:ds="http://schemas.openxmlformats.org/officeDocument/2006/customXml" ds:itemID="{9B035D3D-E8F7-4603-821D-4ED3A43C6A05}">
+<ds:datastoreItem xmlns:ds="http://schemas.openxmlformats.org/officeDocument/2006/customXml" ds:itemID="{37CEB06B-EFF0-4305-B5FA-2CE560D70941}">
   <ds:schemaRefs>
-    <ds:schemaRef ds:uri="http://schemas.microsoft.com/sharepoint/v3/contenttype/forms"/>
+    <ds:schemaRef ds:uri="http://schemas.microsoft.com/office/2006/metadata/properties"/>
+    <ds:schemaRef ds:uri="http://schemas.microsoft.com/office/infopath/2007/PartnerControls"/>
   </ds:schemaRefs>
 </ds:datastoreItem>
 </file>
@@ -20132,4 +21192,12 @@
     <ds:schemaRef ds:uri="http://schemas.microsoft.com/internal/obd"/>
   </ds:schemaRefs>
 </ds:datastoreItem>
+</file>
+
+<file path=customXml/itemProps4.xml><?xml version="1.0" encoding="utf-8"?>
+<ds:datastoreItem xmlns:ds="http://schemas.openxmlformats.org/officeDocument/2006/customXml" ds:itemID="{830E7744-B3AE-4C52-9EFA-073F6F8F8681}">
+  <ds:schemaRefs>
+    <ds:schemaRef ds:uri="http://schemas.openxmlformats.org/officeDocument/2006/bibliography"/>
+  </ds:schemaRefs>
+</ds:datastoreItem>
 </file>
</xml_diff>